<commit_message>
MQTT hozzadasa es dokumentacio
</commit_message>
<xml_diff>
--- a/docs/dokumentacio.docx
+++ b/docs/dokumentacio.docx
@@ -821,13 +821,7 @@
       </w:r>
       <w:proofErr w:type="spellEnd"/>
       <w:r>
-        <w:t>-Fi-ka</w:t>
-      </w:r>
-      <w:r>
-        <w:t>pcsolat létrehozása és az MQTT</w:t>
-      </w:r>
-      <w:r>
-        <w:t xml:space="preserve"> protokoll bevezetése. A </w:t>
+        <w:t xml:space="preserve">-Fi-kapcsolat létrehozása és az MQTT protokoll bevezetése. A </w:t>
       </w:r>
       <w:proofErr w:type="spellStart"/>
       <w:r>
@@ -870,13 +864,7 @@
         <w:jc w:val="both"/>
       </w:pPr>
       <w:r>
-        <w:t xml:space="preserve">A Node.js használatával megvalósított háttérprogram fogadja és </w:t>
-      </w:r>
-      <w:r>
-        <w:t>feldolgozza az MQTT-n keresztül</w:t>
-      </w:r>
-      <w:r>
-        <w:t>érkező adatokat, valamint biztosítja az adatbázissal és a webes felülettel való kapcsolattartást.</w:t>
+        <w:t>A Node.js használatával megvalósított háttérprogram fogadja és feldolgozza az MQTT-n keresztülérkező adatokat, valamint biztosítja az adatbázissal és a webes felülettel való kapcsolattartást.</w:t>
       </w:r>
     </w:p>
     <w:p>
@@ -2970,53 +2958,1042 @@
       </w:r>
       <w:proofErr w:type="gramStart"/>
       <w:r>
-        <w:t>rendszer külö</w:t>
-      </w:r>
+        <w:t>rendszer különböző</w:t>
+      </w:r>
+      <w:proofErr w:type="gramEnd"/>
+      <w:r>
+        <w:t xml:space="preserve"> komponensei közötti kapcsolat alapját, és megteremti a távoli adatmegjelenítés lehetőségét.</w:t>
+      </w:r>
+    </w:p>
+    <w:p>
+      <w:pPr>
+        <w:spacing w:before="100" w:beforeAutospacing="1" w:after="100" w:afterAutospacing="1" w:line="240" w:lineRule="auto"/>
+        <w:ind w:firstLine="708"/>
+        <w:jc w:val="both"/>
+        <w:rPr>
+          <w:rFonts w:ascii="Times New Roman" w:eastAsia="Times New Roman" w:hAnsi="Times New Roman" w:cs="Times New Roman"/>
+          <w:sz w:val="24"/>
+          <w:szCs w:val="24"/>
+          <w:lang w:eastAsia="hu-HU"/>
+        </w:rPr>
+      </w:pPr>
+      <w:r>
+        <w:rPr>
+          <w:rFonts w:ascii="Times New Roman" w:eastAsia="Times New Roman" w:hAnsi="Times New Roman" w:cs="Times New Roman"/>
+          <w:b/>
+          <w:sz w:val="30"/>
+          <w:szCs w:val="30"/>
+          <w:lang w:eastAsia="hu-HU"/>
+        </w:rPr>
+        <w:t>3. A rendszer követelményei</w:t>
+      </w:r>
+    </w:p>
+    <w:p>
+      <w:pPr>
+        <w:pStyle w:val="Cmsor3"/>
+        <w:rPr>
+          <w:rFonts w:ascii="Times New Roman" w:hAnsi="Times New Roman" w:cs="Times New Roman"/>
+          <w:b/>
+          <w:color w:val="000000" w:themeColor="text1"/>
+          <w:sz w:val="26"/>
+          <w:szCs w:val="26"/>
+        </w:rPr>
+      </w:pPr>
+      <w:r>
+        <w:rPr>
+          <w:rFonts w:ascii="Times New Roman" w:hAnsi="Times New Roman" w:cs="Times New Roman"/>
+          <w:b/>
+          <w:color w:val="000000" w:themeColor="text1"/>
+          <w:sz w:val="26"/>
+          <w:szCs w:val="26"/>
+        </w:rPr>
+        <w:t xml:space="preserve">3.1. </w:t>
+      </w:r>
+      <w:proofErr w:type="gramStart"/>
+      <w:r>
+        <w:rPr>
+          <w:rFonts w:ascii="Times New Roman" w:hAnsi="Times New Roman" w:cs="Times New Roman"/>
+          <w:b/>
+          <w:color w:val="000000" w:themeColor="text1"/>
+          <w:sz w:val="26"/>
+          <w:szCs w:val="26"/>
+        </w:rPr>
+        <w:t>Funkcionális</w:t>
+      </w:r>
+      <w:proofErr w:type="gramEnd"/>
+      <w:r>
+        <w:rPr>
+          <w:rFonts w:ascii="Times New Roman" w:hAnsi="Times New Roman" w:cs="Times New Roman"/>
+          <w:b/>
+          <w:color w:val="000000" w:themeColor="text1"/>
+          <w:sz w:val="26"/>
+          <w:szCs w:val="26"/>
+        </w:rPr>
+        <w:t xml:space="preserve"> követelmények</w:t>
+      </w:r>
+    </w:p>
+    <w:p>
+      <w:pPr>
+        <w:pStyle w:val="NormlWeb"/>
+        <w:jc w:val="both"/>
+        <w:rPr>
+          <w:color w:val="000000" w:themeColor="text1"/>
+        </w:rPr>
+      </w:pPr>
+      <w:r>
+        <w:rPr>
+          <w:color w:val="000000" w:themeColor="text1"/>
+        </w:rPr>
+        <w:t xml:space="preserve">A </w:t>
+      </w:r>
+      <w:proofErr w:type="gramStart"/>
+      <w:r>
+        <w:rPr>
+          <w:color w:val="000000" w:themeColor="text1"/>
+        </w:rPr>
+        <w:t>funkcionális</w:t>
+      </w:r>
+      <w:proofErr w:type="gramEnd"/>
+      <w:r>
+        <w:rPr>
+          <w:color w:val="000000" w:themeColor="text1"/>
+        </w:rPr>
+        <w:t xml:space="preserve"> követelmények meghatározzák a gyártósor-felügyeleti rendszer által biztosított szolgáltatásokat és a működéséhez szükséges feladatokat. A rendszer a hardveres vezérlést, az adatkommunikációt, az adatok tárolását és a webes megjelenítést egységes megoldásban valósítja meg.</w:t>
+      </w:r>
+    </w:p>
+    <w:p>
+      <w:pPr>
+        <w:pStyle w:val="NormlWeb"/>
+        <w:jc w:val="both"/>
+        <w:rPr>
+          <w:color w:val="000000" w:themeColor="text1"/>
+        </w:rPr>
+      </w:pPr>
+      <w:r>
+        <w:rPr>
+          <w:color w:val="000000" w:themeColor="text1"/>
+        </w:rPr>
+        <w:t>A gyártósor vezérlését az ESP32-S3 mikrokontroller végzi. A rendszer lehetővé teszi a szimulált gyártósor indítását, normál leállítását, alaphelyzetbe állítását és vészleállítását. Az egyes működési állapotokat különböző színű LED-</w:t>
+      </w:r>
+      <w:proofErr w:type="spellStart"/>
+      <w:r>
+        <w:rPr>
+          <w:color w:val="000000" w:themeColor="text1"/>
+        </w:rPr>
+        <w:t>ek</w:t>
+      </w:r>
+      <w:proofErr w:type="spellEnd"/>
+      <w:r>
+        <w:rPr>
+          <w:color w:val="000000" w:themeColor="text1"/>
+        </w:rPr>
+        <w:t xml:space="preserve"> jelzik, így a gyártósor </w:t>
+      </w:r>
+      <w:proofErr w:type="gramStart"/>
+      <w:r>
+        <w:rPr>
+          <w:color w:val="000000" w:themeColor="text1"/>
+        </w:rPr>
+        <w:t>aktuális</w:t>
+      </w:r>
+      <w:proofErr w:type="gramEnd"/>
+      <w:r>
+        <w:rPr>
+          <w:color w:val="000000" w:themeColor="text1"/>
+        </w:rPr>
+        <w:t xml:space="preserve"> állapota közvetlenül, vizuálisan is ellenőrizhető. A vezérlőprogram a termelési folyamatot szimulálja, és nyilvántartja a legyártott darabok számát.</w:t>
+      </w:r>
+    </w:p>
+    <w:p>
+      <w:pPr>
+        <w:pStyle w:val="NormlWeb"/>
+        <w:jc w:val="both"/>
+        <w:rPr>
+          <w:color w:val="000000" w:themeColor="text1"/>
+        </w:rPr>
+      </w:pPr>
+      <w:r>
+        <w:rPr>
+          <w:color w:val="000000" w:themeColor="text1"/>
+        </w:rPr>
+        <w:lastRenderedPageBreak/>
+        <w:t xml:space="preserve">A mikrokontroller és a háttérrendszer közötti adatátvitel </w:t>
+      </w:r>
+      <w:proofErr w:type="spellStart"/>
+      <w:r>
+        <w:rPr>
+          <w:color w:val="000000" w:themeColor="text1"/>
+        </w:rPr>
+        <w:t>Wi</w:t>
+      </w:r>
+      <w:proofErr w:type="spellEnd"/>
+      <w:r>
+        <w:rPr>
+          <w:color w:val="000000" w:themeColor="text1"/>
+        </w:rPr>
+        <w:t xml:space="preserve">-Fi-kapcsolaton keresztül, MQTT-protokoll alkalmazásával történik. A </w:t>
+      </w:r>
+      <w:proofErr w:type="spellStart"/>
+      <w:r>
+        <w:rPr>
+          <w:color w:val="000000" w:themeColor="text1"/>
+        </w:rPr>
+        <w:t>Mosquitto</w:t>
+      </w:r>
+      <w:proofErr w:type="spellEnd"/>
+      <w:r>
+        <w:rPr>
+          <w:color w:val="000000" w:themeColor="text1"/>
+        </w:rPr>
+        <w:t xml:space="preserve"> MQTT-</w:t>
+      </w:r>
+      <w:proofErr w:type="spellStart"/>
+      <w:r>
+        <w:rPr>
+          <w:color w:val="000000" w:themeColor="text1"/>
+        </w:rPr>
+        <w:t>broker</w:t>
+      </w:r>
+      <w:proofErr w:type="spellEnd"/>
+      <w:r>
+        <w:rPr>
+          <w:color w:val="000000" w:themeColor="text1"/>
+        </w:rPr>
+        <w:t xml:space="preserve"> közvetíti az üzeneteket, míg a Node.js-alapú háttérprogram fogadja és feldolgozza a gyártósor működésével kapcsolatos </w:t>
+      </w:r>
+      <w:proofErr w:type="gramStart"/>
+      <w:r>
+        <w:rPr>
+          <w:color w:val="000000" w:themeColor="text1"/>
+        </w:rPr>
+        <w:t>információkat</w:t>
+      </w:r>
+      <w:proofErr w:type="gramEnd"/>
+      <w:r>
+        <w:rPr>
+          <w:color w:val="000000" w:themeColor="text1"/>
+        </w:rPr>
+        <w:t xml:space="preserve">. A feldolgozott adatok a </w:t>
+      </w:r>
+      <w:proofErr w:type="spellStart"/>
+      <w:r>
+        <w:rPr>
+          <w:color w:val="000000" w:themeColor="text1"/>
+        </w:rPr>
+        <w:t>Supabase</w:t>
+      </w:r>
+      <w:proofErr w:type="spellEnd"/>
+      <w:r>
+        <w:rPr>
+          <w:color w:val="000000" w:themeColor="text1"/>
+        </w:rPr>
+        <w:t xml:space="preserve"> által biztosított </w:t>
+      </w:r>
+      <w:proofErr w:type="spellStart"/>
+      <w:r>
+        <w:rPr>
+          <w:color w:val="000000" w:themeColor="text1"/>
+        </w:rPr>
+        <w:t>PostgreSQL</w:t>
+      </w:r>
+      <w:proofErr w:type="spellEnd"/>
+      <w:r>
+        <w:rPr>
+          <w:color w:val="000000" w:themeColor="text1"/>
+        </w:rPr>
+        <w:t>-adatbázisba kerülnek, ahol strukturált formában tárolhatók és lekérdezhetők.</w:t>
+      </w:r>
+    </w:p>
+    <w:p>
+      <w:pPr>
+        <w:pStyle w:val="NormlWeb"/>
+        <w:jc w:val="both"/>
+        <w:rPr>
+          <w:color w:val="000000" w:themeColor="text1"/>
+        </w:rPr>
+      </w:pPr>
+      <w:r>
+        <w:rPr>
+          <w:color w:val="000000" w:themeColor="text1"/>
+        </w:rPr>
+        <w:t xml:space="preserve">A webes felügyeleti felület HTML, CSS és JavaScript segítségével jeleníti meg a rendszer adatait. A felhasználó megtekintheti a gyártósor </w:t>
+      </w:r>
+      <w:proofErr w:type="gramStart"/>
+      <w:r>
+        <w:rPr>
+          <w:color w:val="000000" w:themeColor="text1"/>
+        </w:rPr>
+        <w:t>aktuális</w:t>
+      </w:r>
+      <w:proofErr w:type="gramEnd"/>
+      <w:r>
+        <w:rPr>
+          <w:color w:val="000000" w:themeColor="text1"/>
+        </w:rPr>
+        <w:t xml:space="preserve"> működési állapotát, a termelési darabszámot és a tárolt információkat. A felület grafikonokkal és statisztikákkal szemlélteti a termelés alakulását, valamint áttekinthető módon biztosítja a rendszer működésének nyomon követését.</w:t>
+      </w:r>
+    </w:p>
+    <w:p>
+      <w:pPr>
+        <w:pStyle w:val="NormlWeb"/>
+        <w:jc w:val="both"/>
+        <w:rPr>
+          <w:color w:val="000000" w:themeColor="text1"/>
+        </w:rPr>
+      </w:pPr>
+      <w:r>
+        <w:rPr>
+          <w:color w:val="000000" w:themeColor="text1"/>
+        </w:rPr>
+        <w:t xml:space="preserve">A rendszer legfontosabb </w:t>
+      </w:r>
+      <w:proofErr w:type="gramStart"/>
+      <w:r>
+        <w:rPr>
+          <w:color w:val="000000" w:themeColor="text1"/>
+        </w:rPr>
+        <w:t>funkcionális</w:t>
+      </w:r>
+      <w:proofErr w:type="gramEnd"/>
+      <w:r>
+        <w:rPr>
+          <w:color w:val="000000" w:themeColor="text1"/>
+        </w:rPr>
+        <w:t xml:space="preserve"> követelményei a következők:</w:t>
+      </w:r>
+    </w:p>
+    <w:p>
+      <w:pPr>
+        <w:pStyle w:val="NormlWeb"/>
+        <w:numPr>
+          <w:ilvl w:val="0"/>
+          <w:numId w:val="2"/>
+        </w:numPr>
+        <w:jc w:val="both"/>
+        <w:rPr>
+          <w:color w:val="000000" w:themeColor="text1"/>
+        </w:rPr>
+      </w:pPr>
+      <w:r>
+        <w:rPr>
+          <w:color w:val="000000" w:themeColor="text1"/>
+        </w:rPr>
+        <w:t>A gyártósor indítása, normál leállítása, alaphelyzetbe állítása és vészleállítása.</w:t>
+      </w:r>
+    </w:p>
+    <w:p>
+      <w:pPr>
+        <w:pStyle w:val="NormlWeb"/>
+        <w:numPr>
+          <w:ilvl w:val="0"/>
+          <w:numId w:val="2"/>
+        </w:numPr>
+        <w:jc w:val="both"/>
+        <w:rPr>
+          <w:color w:val="000000" w:themeColor="text1"/>
+        </w:rPr>
+      </w:pPr>
+      <w:r>
+        <w:rPr>
+          <w:color w:val="000000" w:themeColor="text1"/>
+        </w:rPr>
+        <w:t>A működési állapotok vizuális jelzése LED-</w:t>
+      </w:r>
+      <w:proofErr w:type="spellStart"/>
+      <w:r>
+        <w:rPr>
+          <w:color w:val="000000" w:themeColor="text1"/>
+        </w:rPr>
+        <w:t>ek</w:t>
+      </w:r>
+      <w:proofErr w:type="spellEnd"/>
+      <w:r>
+        <w:rPr>
+          <w:color w:val="000000" w:themeColor="text1"/>
+        </w:rPr>
+        <w:t xml:space="preserve"> segítségével.</w:t>
+      </w:r>
+    </w:p>
+    <w:p>
+      <w:pPr>
+        <w:pStyle w:val="NormlWeb"/>
+        <w:numPr>
+          <w:ilvl w:val="0"/>
+          <w:numId w:val="2"/>
+        </w:numPr>
+        <w:jc w:val="both"/>
+        <w:rPr>
+          <w:color w:val="000000" w:themeColor="text1"/>
+        </w:rPr>
+      </w:pPr>
+      <w:r>
+        <w:rPr>
+          <w:color w:val="000000" w:themeColor="text1"/>
+        </w:rPr>
+        <w:t>A termelési folyamat szimulálása és a legyártott darabok számának nyilvántartása.</w:t>
+      </w:r>
+    </w:p>
+    <w:p>
+      <w:pPr>
+        <w:pStyle w:val="NormlWeb"/>
+        <w:numPr>
+          <w:ilvl w:val="0"/>
+          <w:numId w:val="2"/>
+        </w:numPr>
+        <w:jc w:val="both"/>
+        <w:rPr>
+          <w:color w:val="000000" w:themeColor="text1"/>
+        </w:rPr>
+      </w:pPr>
+      <w:r>
+        <w:rPr>
+          <w:color w:val="000000" w:themeColor="text1"/>
+        </w:rPr>
+        <w:t>A működési adatok továbbítása MQTT-protokollon keresztül.</w:t>
+      </w:r>
+    </w:p>
+    <w:p>
+      <w:pPr>
+        <w:pStyle w:val="NormlWeb"/>
+        <w:numPr>
+          <w:ilvl w:val="0"/>
+          <w:numId w:val="2"/>
+        </w:numPr>
+        <w:jc w:val="both"/>
+        <w:rPr>
+          <w:color w:val="000000" w:themeColor="text1"/>
+        </w:rPr>
+      </w:pPr>
+      <w:r>
+        <w:rPr>
+          <w:color w:val="000000" w:themeColor="text1"/>
+        </w:rPr>
+        <w:t>A beérkező üzenetek fogadása és feldolgozása a háttérrendszerben.</w:t>
+      </w:r>
+    </w:p>
+    <w:p>
+      <w:pPr>
+        <w:pStyle w:val="NormlWeb"/>
+        <w:numPr>
+          <w:ilvl w:val="0"/>
+          <w:numId w:val="2"/>
+        </w:numPr>
+        <w:jc w:val="both"/>
+        <w:rPr>
+          <w:color w:val="000000" w:themeColor="text1"/>
+        </w:rPr>
+      </w:pPr>
+      <w:r>
+        <w:rPr>
+          <w:color w:val="000000" w:themeColor="text1"/>
+        </w:rPr>
+        <w:t xml:space="preserve">A termelési adatok és a működési események tárolása a </w:t>
+      </w:r>
+      <w:proofErr w:type="spellStart"/>
+      <w:r>
+        <w:rPr>
+          <w:color w:val="000000" w:themeColor="text1"/>
+        </w:rPr>
+        <w:t>PostgreSQL</w:t>
+      </w:r>
+      <w:proofErr w:type="spellEnd"/>
+      <w:r>
+        <w:rPr>
+          <w:color w:val="000000" w:themeColor="text1"/>
+        </w:rPr>
+        <w:t>-adatbázisban.</w:t>
+      </w:r>
+    </w:p>
+    <w:p>
+      <w:pPr>
+        <w:pStyle w:val="NormlWeb"/>
+        <w:numPr>
+          <w:ilvl w:val="0"/>
+          <w:numId w:val="2"/>
+        </w:numPr>
+        <w:jc w:val="both"/>
+        <w:rPr>
+          <w:color w:val="000000" w:themeColor="text1"/>
+        </w:rPr>
+      </w:pPr>
+      <w:r>
+        <w:rPr>
+          <w:color w:val="000000" w:themeColor="text1"/>
+        </w:rPr>
+        <w:t>A gyártósor állapotának és a termelési adatoknak a megjelenítése a webes felületen.</w:t>
+      </w:r>
+    </w:p>
+    <w:p>
+      <w:pPr>
+        <w:pStyle w:val="NormlWeb"/>
+        <w:numPr>
+          <w:ilvl w:val="0"/>
+          <w:numId w:val="2"/>
+        </w:numPr>
+        <w:jc w:val="both"/>
+        <w:rPr>
+          <w:color w:val="000000" w:themeColor="text1"/>
+        </w:rPr>
+      </w:pPr>
+      <w:r>
+        <w:rPr>
+          <w:color w:val="000000" w:themeColor="text1"/>
+        </w:rPr>
+        <w:t>A tárolt adatok lekérdezése és grafikonokon, illetve statisztikákon keresztüli megjelenítése.</w:t>
+      </w:r>
+    </w:p>
+    <w:p>
+      <w:pPr>
+        <w:pStyle w:val="NormlWeb"/>
+        <w:jc w:val="both"/>
+        <w:rPr>
+          <w:color w:val="000000" w:themeColor="text1"/>
+        </w:rPr>
+      </w:pPr>
+      <w:r>
+        <w:rPr>
+          <w:color w:val="000000" w:themeColor="text1"/>
+        </w:rPr>
+        <w:t xml:space="preserve">A </w:t>
+      </w:r>
+      <w:proofErr w:type="gramStart"/>
+      <w:r>
+        <w:rPr>
+          <w:color w:val="000000" w:themeColor="text1"/>
+        </w:rPr>
+        <w:t>funkcionális</w:t>
+      </w:r>
+      <w:proofErr w:type="gramEnd"/>
+      <w:r>
+        <w:rPr>
+          <w:color w:val="000000" w:themeColor="text1"/>
+        </w:rPr>
+        <w:t xml:space="preserve"> követelmények biztosítják, hogy a rendszer a gyártósor szimulált működésétől kezdve az adatok továbbításán és tárolásán át egészen a webes megjelenítésig egységes folyamatként működjön.</w:t>
+      </w:r>
+    </w:p>
+    <w:p>
+      <w:pPr>
+        <w:pStyle w:val="Cmsor3"/>
+        <w:rPr>
+          <w:rFonts w:ascii="Times New Roman" w:hAnsi="Times New Roman" w:cs="Times New Roman"/>
+          <w:b/>
+          <w:color w:val="000000" w:themeColor="text1"/>
+          <w:sz w:val="26"/>
+          <w:szCs w:val="26"/>
+        </w:rPr>
+      </w:pPr>
+      <w:r>
+        <w:rPr>
+          <w:rFonts w:ascii="Times New Roman" w:hAnsi="Times New Roman" w:cs="Times New Roman"/>
+          <w:b/>
+          <w:color w:val="000000" w:themeColor="text1"/>
+          <w:sz w:val="26"/>
+          <w:szCs w:val="26"/>
+        </w:rPr>
+        <w:t xml:space="preserve">3.2. Nem </w:t>
+      </w:r>
+      <w:proofErr w:type="gramStart"/>
+      <w:r>
+        <w:rPr>
+          <w:rFonts w:ascii="Times New Roman" w:hAnsi="Times New Roman" w:cs="Times New Roman"/>
+          <w:b/>
+          <w:color w:val="000000" w:themeColor="text1"/>
+          <w:sz w:val="26"/>
+          <w:szCs w:val="26"/>
+        </w:rPr>
+        <w:t>funkcionális</w:t>
+      </w:r>
+      <w:proofErr w:type="gramEnd"/>
+      <w:r>
+        <w:rPr>
+          <w:rFonts w:ascii="Times New Roman" w:hAnsi="Times New Roman" w:cs="Times New Roman"/>
+          <w:b/>
+          <w:color w:val="000000" w:themeColor="text1"/>
+          <w:sz w:val="26"/>
+          <w:szCs w:val="26"/>
+        </w:rPr>
+        <w:t xml:space="preserve"> követelmények</w:t>
+      </w:r>
+    </w:p>
+    <w:p>
+      <w:pPr>
+        <w:pStyle w:val="NormlWeb"/>
+        <w:jc w:val="both"/>
+      </w:pPr>
       <w:bookmarkStart w:id="0" w:name="_GoBack"/>
       <w:bookmarkEnd w:id="0"/>
       <w:r>
-        <w:t>nböző</w:t>
+        <w:t xml:space="preserve">A nem </w:t>
+      </w:r>
+      <w:proofErr w:type="gramStart"/>
+      <w:r>
+        <w:t>funkcionális</w:t>
       </w:r>
       <w:proofErr w:type="gramEnd"/>
       <w:r>
-        <w:t xml:space="preserve"> komponensei közötti kapcsolat alapját, és megteremti a távoli adatmegjelenítés lehetőségét.</w:t>
-      </w:r>
-    </w:p>
-    <w:p>
-      <w:pPr>
-        <w:spacing w:before="100" w:beforeAutospacing="1" w:after="100" w:afterAutospacing="1" w:line="240" w:lineRule="auto"/>
-        <w:jc w:val="both"/>
-        <w:rPr>
-          <w:rFonts w:ascii="Times New Roman" w:eastAsia="Times New Roman" w:hAnsi="Times New Roman" w:cs="Times New Roman"/>
-          <w:sz w:val="24"/>
-          <w:szCs w:val="24"/>
-          <w:lang w:eastAsia="hu-HU"/>
-        </w:rPr>
-      </w:pPr>
-    </w:p>
-    <w:p>
-      <w:pPr>
-        <w:pStyle w:val="NormlWeb"/>
-        <w:jc w:val="both"/>
-      </w:pPr>
-    </w:p>
-    <w:p>
-      <w:pPr>
-        <w:pStyle w:val="NormlWeb"/>
-        <w:jc w:val="both"/>
-      </w:pPr>
-    </w:p>
-    <w:p>
-      <w:pPr>
-        <w:pStyle w:val="NormlWeb"/>
-        <w:jc w:val="both"/>
-      </w:pPr>
-    </w:p>
-    <w:p>
-      <w:pPr>
-        <w:jc w:val="both"/>
+        <w:t xml:space="preserve"> követelmények a gyártósor-felügyeleti rendszer működésének minőségét, megbízhatóságát, biztonságát és használhatóságát határozzák meg.</w:t>
+      </w:r>
+    </w:p>
+    <w:p>
+      <w:pPr>
+        <w:pStyle w:val="NormlWeb"/>
+        <w:jc w:val="both"/>
+      </w:pPr>
+      <w:r>
+        <w:t xml:space="preserve">● </w:t>
+      </w:r>
+      <w:r>
+        <w:rPr>
+          <w:rStyle w:val="Kiemels2"/>
+          <w:rFonts w:eastAsiaTheme="majorEastAsia"/>
+          <w:b w:val="0"/>
+          <w:u w:val="single"/>
+        </w:rPr>
+        <w:t>Megbízhatóság</w:t>
+      </w:r>
+      <w:r>
+        <w:rPr>
+          <w:rStyle w:val="Kiemels2"/>
+          <w:rFonts w:eastAsiaTheme="majorEastAsia"/>
+        </w:rPr>
+        <w:t>:</w:t>
+      </w:r>
+      <w:r>
+        <w:t xml:space="preserve"> A rendszer megfelelően kezeli a gyártósor állapotváltozásait. Az adatkommunikáció során fellépő hibák kezelése hozzájárul a folyamatos működéshez.</w:t>
+      </w:r>
+    </w:p>
+    <w:p>
+      <w:pPr>
+        <w:pStyle w:val="NormlWeb"/>
+        <w:jc w:val="both"/>
+      </w:pPr>
+      <w:r>
+        <w:t xml:space="preserve">● </w:t>
+      </w:r>
+      <w:r>
+        <w:rPr>
+          <w:rStyle w:val="Kiemels2"/>
+          <w:rFonts w:eastAsiaTheme="majorEastAsia"/>
+          <w:b w:val="0"/>
+          <w:u w:val="single"/>
+        </w:rPr>
+        <w:t>Teljesítmény</w:t>
+      </w:r>
+      <w:r>
+        <w:rPr>
+          <w:rStyle w:val="Kiemels2"/>
+          <w:rFonts w:eastAsiaTheme="majorEastAsia"/>
+        </w:rPr>
+        <w:t>:</w:t>
+      </w:r>
+      <w:r>
+        <w:t xml:space="preserve"> A gyártósor állapotára és a termelésre vonatkozó adatok továbbítása, feldolgozása és megjelenítése rövid időn belül történik.</w:t>
+      </w:r>
+    </w:p>
+    <w:p>
+      <w:pPr>
+        <w:pStyle w:val="NormlWeb"/>
+        <w:jc w:val="both"/>
+      </w:pPr>
+      <w:r>
+        <w:t xml:space="preserve">● </w:t>
+      </w:r>
+      <w:r>
+        <w:rPr>
+          <w:rStyle w:val="Kiemels2"/>
+          <w:rFonts w:eastAsiaTheme="majorEastAsia"/>
+          <w:b w:val="0"/>
+          <w:u w:val="single"/>
+        </w:rPr>
+        <w:t>Biztonság</w:t>
+      </w:r>
+      <w:r>
+        <w:rPr>
+          <w:rStyle w:val="Kiemels2"/>
+          <w:rFonts w:eastAsiaTheme="majorEastAsia"/>
+        </w:rPr>
+        <w:t>:</w:t>
+      </w:r>
+      <w:r>
+        <w:t xml:space="preserve"> A hálózati kommunikáció és az adatbázis-hozzáférés megfelelő védelmi intézkedésekkel működik. A hozzáférési jogosultságok szabályozzák az adatok elérhetőségét.</w:t>
+      </w:r>
+    </w:p>
+    <w:p>
+      <w:pPr>
+        <w:pStyle w:val="NormlWeb"/>
+        <w:jc w:val="both"/>
+      </w:pPr>
+      <w:r>
+        <w:t xml:space="preserve">● </w:t>
+      </w:r>
+      <w:r>
+        <w:rPr>
+          <w:rStyle w:val="Kiemels2"/>
+          <w:rFonts w:eastAsiaTheme="majorEastAsia"/>
+          <w:b w:val="0"/>
+          <w:u w:val="single"/>
+        </w:rPr>
+        <w:t>Kezelhetőség</w:t>
+      </w:r>
+      <w:r>
+        <w:rPr>
+          <w:rStyle w:val="Kiemels2"/>
+          <w:rFonts w:eastAsiaTheme="majorEastAsia"/>
+        </w:rPr>
+        <w:t>:</w:t>
+      </w:r>
+      <w:r>
+        <w:t xml:space="preserve"> A webes felügyeleti felület áttekinthetően jeleníti meg a gyártósor állapotát és a termelési adatokat. Az egyértelmű vizuális jelzések megkönnyítik a rendszer használatát.</w:t>
+      </w:r>
+    </w:p>
+    <w:p>
+      <w:pPr>
+        <w:pStyle w:val="NormlWeb"/>
+        <w:jc w:val="both"/>
+      </w:pPr>
+      <w:r>
+        <w:t xml:space="preserve">● </w:t>
+      </w:r>
+      <w:r>
+        <w:rPr>
+          <w:rStyle w:val="Kiemels2"/>
+          <w:rFonts w:eastAsiaTheme="majorEastAsia"/>
+          <w:b w:val="0"/>
+          <w:u w:val="single"/>
+        </w:rPr>
+        <w:t>Bővíthetőség</w:t>
+      </w:r>
+      <w:r>
+        <w:rPr>
+          <w:rStyle w:val="Kiemels2"/>
+          <w:rFonts w:eastAsiaTheme="majorEastAsia"/>
+        </w:rPr>
+        <w:t>:</w:t>
+      </w:r>
+      <w:r>
+        <w:t xml:space="preserve"> A rendszer moduláris felépítése lehetővé teszi az egyes </w:t>
+      </w:r>
+      <w:proofErr w:type="gramStart"/>
+      <w:r>
+        <w:t>komponensek</w:t>
+      </w:r>
+      <w:proofErr w:type="gramEnd"/>
+      <w:r>
+        <w:t xml:space="preserve"> önálló módosítását és új funkciók hozzáadását.</w:t>
+      </w:r>
+    </w:p>
+    <w:p>
+      <w:pPr>
+        <w:pStyle w:val="NormlWeb"/>
+        <w:jc w:val="both"/>
+      </w:pPr>
+      <w:r>
+        <w:lastRenderedPageBreak/>
+        <w:t xml:space="preserve">● </w:t>
+      </w:r>
+      <w:r>
+        <w:rPr>
+          <w:rStyle w:val="Kiemels2"/>
+          <w:rFonts w:eastAsiaTheme="majorEastAsia"/>
+          <w:b w:val="0"/>
+          <w:u w:val="single"/>
+        </w:rPr>
+        <w:t>Karbantarthatóság</w:t>
+      </w:r>
+      <w:r>
+        <w:rPr>
+          <w:rStyle w:val="Kiemels2"/>
+          <w:rFonts w:eastAsiaTheme="majorEastAsia"/>
+        </w:rPr>
+        <w:t>:</w:t>
+      </w:r>
+      <w:r>
+        <w:t xml:space="preserve"> A programkód strukturált felépítése és az egyértelmű elnevezések elősegítik a kód áttekinthetőségét. A </w:t>
+      </w:r>
+      <w:proofErr w:type="spellStart"/>
+      <w:r>
+        <w:t>Git</w:t>
+      </w:r>
+      <w:proofErr w:type="spellEnd"/>
+      <w:r>
+        <w:t xml:space="preserve"> és a </w:t>
+      </w:r>
+      <w:proofErr w:type="spellStart"/>
+      <w:r>
+        <w:t>GitHub</w:t>
+      </w:r>
+      <w:proofErr w:type="spellEnd"/>
+      <w:r>
+        <w:t xml:space="preserve"> támogatja a módosítások nyomon követését és a korábbi verziók visszakeresését.</w:t>
+      </w:r>
+    </w:p>
+    <w:p>
+      <w:pPr>
+        <w:pStyle w:val="NormlWeb"/>
+        <w:jc w:val="both"/>
+      </w:pPr>
+      <w:r>
+        <w:t xml:space="preserve">● </w:t>
+      </w:r>
+      <w:proofErr w:type="gramStart"/>
+      <w:r>
+        <w:rPr>
+          <w:rStyle w:val="Kiemels2"/>
+          <w:rFonts w:eastAsiaTheme="majorEastAsia"/>
+          <w:b w:val="0"/>
+          <w:u w:val="single"/>
+        </w:rPr>
+        <w:t>Kompatibilitás</w:t>
+      </w:r>
+      <w:proofErr w:type="gramEnd"/>
+      <w:r>
+        <w:rPr>
+          <w:rStyle w:val="Kiemels2"/>
+          <w:rFonts w:eastAsiaTheme="majorEastAsia"/>
+        </w:rPr>
+        <w:t>:</w:t>
+      </w:r>
+      <w:r>
+        <w:t xml:space="preserve"> Az ESP32-S3 mikrokontroller, a </w:t>
+      </w:r>
+      <w:proofErr w:type="spellStart"/>
+      <w:r>
+        <w:t>Mosquitto</w:t>
+      </w:r>
+      <w:proofErr w:type="spellEnd"/>
+      <w:r>
+        <w:t xml:space="preserve"> MQTT-</w:t>
+      </w:r>
+      <w:proofErr w:type="spellStart"/>
+      <w:r>
+        <w:t>broker</w:t>
+      </w:r>
+      <w:proofErr w:type="spellEnd"/>
+      <w:r>
+        <w:t xml:space="preserve">, a Node.js-alapú háttérrendszer, a </w:t>
+      </w:r>
+      <w:proofErr w:type="spellStart"/>
+      <w:r>
+        <w:t>Supabase</w:t>
+      </w:r>
+      <w:proofErr w:type="spellEnd"/>
+      <w:r>
+        <w:t xml:space="preserve"> </w:t>
+      </w:r>
+      <w:proofErr w:type="spellStart"/>
+      <w:r>
+        <w:t>PostgreSQL</w:t>
+      </w:r>
+      <w:proofErr w:type="spellEnd"/>
+      <w:r>
+        <w:t>-adatbázisa és a webes felület összehangolt működése biztosítja az adatok továbbítását és megjelenítését.</w:t>
+      </w:r>
+    </w:p>
+    <w:p>
+      <w:pPr>
+        <w:pStyle w:val="NormlWeb"/>
+        <w:jc w:val="both"/>
+      </w:pPr>
+      <w:r>
+        <w:t xml:space="preserve">A nem </w:t>
+      </w:r>
+      <w:proofErr w:type="gramStart"/>
+      <w:r>
+        <w:t>funkcionális</w:t>
+      </w:r>
+      <w:proofErr w:type="gramEnd"/>
+      <w:r>
+        <w:t xml:space="preserve"> követelmények célja, hogy a rendszer a meghatározott feladatokat átlátható, biztonságos, karbantartható és bővíthető módon lássa el.</w:t>
+      </w:r>
+    </w:p>
+    <w:p>
+      <w:pPr>
+        <w:pStyle w:val="Cmsor3"/>
         <w:rPr>
           <w:rFonts w:ascii="Times New Roman" w:hAnsi="Times New Roman" w:cs="Times New Roman"/>
+          <w:b/>
+          <w:color w:val="000000" w:themeColor="text1"/>
+          <w:sz w:val="26"/>
+          <w:szCs w:val="26"/>
+        </w:rPr>
+      </w:pPr>
+      <w:r>
+        <w:rPr>
+          <w:rFonts w:ascii="Times New Roman" w:hAnsi="Times New Roman" w:cs="Times New Roman"/>
+          <w:b/>
+          <w:color w:val="000000" w:themeColor="text1"/>
+          <w:sz w:val="26"/>
+          <w:szCs w:val="26"/>
+        </w:rPr>
+        <w:t>3.3. A rendszerrel szemben támasztott elvárások</w:t>
+      </w:r>
+    </w:p>
+    <w:p>
+      <w:pPr>
+        <w:pStyle w:val="NormlWeb"/>
+        <w:jc w:val="both"/>
+      </w:pPr>
+      <w:r>
+        <w:t>A gyártósor-felügyeleti rendszer kialakításának célja egy olyan megoldás létrehozása, amely lehetővé teszi a szimulált gyártási folyamat egyszerű vezérlését, a működési adatok továbbítását és azok webes felületen történő megjelenítését. A rendszerrel szemben alapvető elvárás az egyszerű kezelhetőség, amelyet az egyértelmű vezérlőgombok és a különböző működési állapotokat jelző LED-</w:t>
+      </w:r>
+      <w:proofErr w:type="spellStart"/>
+      <w:r>
+        <w:t>ek</w:t>
+      </w:r>
+      <w:proofErr w:type="spellEnd"/>
+      <w:r>
+        <w:t xml:space="preserve"> biztosítanak. A webes felület segítségével a felhasználó nyomon követheti a gyártósor </w:t>
+      </w:r>
+      <w:proofErr w:type="gramStart"/>
+      <w:r>
+        <w:t>aktuális</w:t>
+      </w:r>
+      <w:proofErr w:type="gramEnd"/>
+      <w:r>
+        <w:t xml:space="preserve"> állapotát és a termelési darabszám alakulását.</w:t>
+      </w:r>
+    </w:p>
+    <w:p>
+      <w:pPr>
+        <w:pStyle w:val="NormlWeb"/>
+        <w:jc w:val="both"/>
+      </w:pPr>
+      <w:r>
+        <w:t xml:space="preserve">Fontos szempont a keletkező adatok megfelelő kezelése és tárolása is. A rendszer a gyártási folyamat során összegyűjtött </w:t>
+      </w:r>
+      <w:proofErr w:type="gramStart"/>
+      <w:r>
+        <w:t>információkat</w:t>
+      </w:r>
+      <w:proofErr w:type="gramEnd"/>
+      <w:r>
+        <w:t xml:space="preserve"> strukturált formában tárolja a </w:t>
+      </w:r>
+      <w:proofErr w:type="spellStart"/>
+      <w:r>
+        <w:t>PostgreSQL</w:t>
+      </w:r>
+      <w:proofErr w:type="spellEnd"/>
+      <w:r>
+        <w:t xml:space="preserve">-adatbázisban, így azok később visszakereshetők és elemezhetők. Az ESP32-S3 mikrokontroller és a háttérrendszer közötti kommunikáció </w:t>
+      </w:r>
+      <w:proofErr w:type="spellStart"/>
+      <w:r>
+        <w:t>Wi</w:t>
+      </w:r>
+      <w:proofErr w:type="spellEnd"/>
+      <w:r>
+        <w:t xml:space="preserve">-Fi-kapcsolaton és MQTT-protokollon </w:t>
+      </w:r>
+      <w:proofErr w:type="gramStart"/>
+      <w:r>
+        <w:t>keresztül történik</w:t>
+      </w:r>
+      <w:proofErr w:type="gramEnd"/>
+      <w:r>
+        <w:t>. A Node.js-alapú háttérprogram fogadja és feldolgozza az érkező üzeneteket, majd gondoskodik az adatok adatbázisba továbbításáról.</w:t>
+      </w:r>
+    </w:p>
+    <w:p>
+      <w:pPr>
+        <w:pStyle w:val="NormlWeb"/>
+        <w:jc w:val="both"/>
+      </w:pPr>
+      <w:r>
+        <w:t xml:space="preserve">A webes felügyeleti felület kialakításánál az áttekinthetőség és az </w:t>
+      </w:r>
+      <w:proofErr w:type="gramStart"/>
+      <w:r>
+        <w:t>információk</w:t>
+      </w:r>
+      <w:proofErr w:type="gramEnd"/>
+      <w:r>
+        <w:t xml:space="preserve"> könnyű értelmezhetősége kap kiemelt szerepet. A rendszer a gyártósor állapotát és a termelési adatokat jól értelmezhető formában jeleníti meg, szükség esetén grafikonokkal és statisztikákkal kiegészítve. A rendszer további fontos elvárása a moduláris felépítés, amely lehetővé teszi az egyes </w:t>
+      </w:r>
+      <w:proofErr w:type="gramStart"/>
+      <w:r>
+        <w:t>komponensek</w:t>
+      </w:r>
+      <w:proofErr w:type="gramEnd"/>
+      <w:r>
+        <w:t xml:space="preserve"> önálló fejlesztését és későbbi bővítését.</w:t>
+      </w:r>
+    </w:p>
+    <w:p>
+      <w:pPr>
+        <w:pStyle w:val="NormlWeb"/>
+        <w:jc w:val="both"/>
+      </w:pPr>
+      <w:r>
+        <w:t xml:space="preserve">A megvalósítás során a költséghatékonyság és a karbantarthatóság szintén lényeges szempont. A projekt széles körben használt fejlesztőeszközökre és technológiákra épül, amelyek támogatják a rendszer gazdaságos kialakítását. A </w:t>
+      </w:r>
+      <w:proofErr w:type="spellStart"/>
+      <w:r>
+        <w:t>Git</w:t>
+      </w:r>
+      <w:proofErr w:type="spellEnd"/>
+      <w:r>
+        <w:t xml:space="preserve"> és a </w:t>
+      </w:r>
+      <w:proofErr w:type="spellStart"/>
+      <w:r>
+        <w:t>GitHub</w:t>
+      </w:r>
+      <w:proofErr w:type="spellEnd"/>
+      <w:r>
+        <w:t xml:space="preserve"> használata biztosítja a forráskód változásainak nyomon követését és a fejlesztési folyamat dokumentálását. Ezek az elvárások együttesen hozzájárulnak egy átlátható, kezelhető és </w:t>
+      </w:r>
+      <w:proofErr w:type="spellStart"/>
+      <w:r>
+        <w:t>továbbfejleszthető</w:t>
+      </w:r>
+      <w:proofErr w:type="spellEnd"/>
+      <w:r>
+        <w:t xml:space="preserve"> gyártósor-felügyeleti rendszer kialakításához.</w:t>
+      </w:r>
+    </w:p>
+    <w:p>
+      <w:pPr>
+        <w:pStyle w:val="NormlWeb"/>
+        <w:jc w:val="both"/>
+        <w:rPr>
+          <w:color w:val="000000" w:themeColor="text1"/>
+        </w:rPr>
+      </w:pPr>
+    </w:p>
+    <w:p>
+      <w:pPr>
+        <w:pStyle w:val="NormlWeb"/>
+        <w:jc w:val="both"/>
+        <w:rPr>
+          <w:color w:val="000000" w:themeColor="text1"/>
+        </w:rPr>
+      </w:pPr>
+    </w:p>
+    <w:p>
+      <w:pPr>
+        <w:pStyle w:val="NormlWeb"/>
+        <w:jc w:val="both"/>
+        <w:rPr>
+          <w:color w:val="000000" w:themeColor="text1"/>
+        </w:rPr>
+      </w:pPr>
+    </w:p>
+    <w:p>
+      <w:pPr>
+        <w:pStyle w:val="NormlWeb"/>
+        <w:jc w:val="both"/>
+        <w:rPr>
+          <w:color w:val="000000" w:themeColor="text1"/>
+        </w:rPr>
+      </w:pPr>
+    </w:p>
+    <w:p>
+      <w:pPr>
+        <w:jc w:val="both"/>
+        <w:rPr>
+          <w:rFonts w:ascii="Times New Roman" w:hAnsi="Times New Roman" w:cs="Times New Roman"/>
+          <w:color w:val="000000" w:themeColor="text1"/>
           <w:sz w:val="24"/>
           <w:szCs w:val="24"/>
         </w:rPr>
@@ -3120,8 +4097,160 @@
       </w:pPr>
     </w:lvl>
   </w:abstractNum>
+  <w:abstractNum w:abstractNumId="1" w15:restartNumberingAfterBreak="0">
+    <w:nsid w:val="3A81351E"/>
+    <w:multiLevelType w:val="multilevel"/>
+    <w:tmpl w:val="FD3EC2B6"/>
+    <w:lvl w:ilvl="0">
+      <w:start w:val="1"/>
+      <w:numFmt w:val="bullet"/>
+      <w:lvlText w:val=""/>
+      <w:lvlJc w:val="left"/>
+      <w:pPr>
+        <w:tabs>
+          <w:tab w:val="num" w:pos="720"/>
+        </w:tabs>
+        <w:ind w:left="720" w:hanging="360"/>
+      </w:pPr>
+      <w:rPr>
+        <w:rFonts w:ascii="Symbol" w:hAnsi="Symbol" w:hint="default"/>
+        <w:sz w:val="20"/>
+      </w:rPr>
+    </w:lvl>
+    <w:lvl w:ilvl="1" w:tentative="1">
+      <w:start w:val="1"/>
+      <w:numFmt w:val="bullet"/>
+      <w:lvlText w:val="o"/>
+      <w:lvlJc w:val="left"/>
+      <w:pPr>
+        <w:tabs>
+          <w:tab w:val="num" w:pos="1440"/>
+        </w:tabs>
+        <w:ind w:left="1440" w:hanging="360"/>
+      </w:pPr>
+      <w:rPr>
+        <w:rFonts w:ascii="Courier New" w:hAnsi="Courier New" w:hint="default"/>
+        <w:sz w:val="20"/>
+      </w:rPr>
+    </w:lvl>
+    <w:lvl w:ilvl="2" w:tentative="1">
+      <w:start w:val="1"/>
+      <w:numFmt w:val="bullet"/>
+      <w:lvlText w:val=""/>
+      <w:lvlJc w:val="left"/>
+      <w:pPr>
+        <w:tabs>
+          <w:tab w:val="num" w:pos="2160"/>
+        </w:tabs>
+        <w:ind w:left="2160" w:hanging="360"/>
+      </w:pPr>
+      <w:rPr>
+        <w:rFonts w:ascii="Wingdings" w:hAnsi="Wingdings" w:hint="default"/>
+        <w:sz w:val="20"/>
+      </w:rPr>
+    </w:lvl>
+    <w:lvl w:ilvl="3" w:tentative="1">
+      <w:start w:val="1"/>
+      <w:numFmt w:val="bullet"/>
+      <w:lvlText w:val=""/>
+      <w:lvlJc w:val="left"/>
+      <w:pPr>
+        <w:tabs>
+          <w:tab w:val="num" w:pos="2880"/>
+        </w:tabs>
+        <w:ind w:left="2880" w:hanging="360"/>
+      </w:pPr>
+      <w:rPr>
+        <w:rFonts w:ascii="Wingdings" w:hAnsi="Wingdings" w:hint="default"/>
+        <w:sz w:val="20"/>
+      </w:rPr>
+    </w:lvl>
+    <w:lvl w:ilvl="4" w:tentative="1">
+      <w:start w:val="1"/>
+      <w:numFmt w:val="bullet"/>
+      <w:lvlText w:val=""/>
+      <w:lvlJc w:val="left"/>
+      <w:pPr>
+        <w:tabs>
+          <w:tab w:val="num" w:pos="3600"/>
+        </w:tabs>
+        <w:ind w:left="3600" w:hanging="360"/>
+      </w:pPr>
+      <w:rPr>
+        <w:rFonts w:ascii="Wingdings" w:hAnsi="Wingdings" w:hint="default"/>
+        <w:sz w:val="20"/>
+      </w:rPr>
+    </w:lvl>
+    <w:lvl w:ilvl="5" w:tentative="1">
+      <w:start w:val="1"/>
+      <w:numFmt w:val="bullet"/>
+      <w:lvlText w:val=""/>
+      <w:lvlJc w:val="left"/>
+      <w:pPr>
+        <w:tabs>
+          <w:tab w:val="num" w:pos="4320"/>
+        </w:tabs>
+        <w:ind w:left="4320" w:hanging="360"/>
+      </w:pPr>
+      <w:rPr>
+        <w:rFonts w:ascii="Wingdings" w:hAnsi="Wingdings" w:hint="default"/>
+        <w:sz w:val="20"/>
+      </w:rPr>
+    </w:lvl>
+    <w:lvl w:ilvl="6" w:tentative="1">
+      <w:start w:val="1"/>
+      <w:numFmt w:val="bullet"/>
+      <w:lvlText w:val=""/>
+      <w:lvlJc w:val="left"/>
+      <w:pPr>
+        <w:tabs>
+          <w:tab w:val="num" w:pos="5040"/>
+        </w:tabs>
+        <w:ind w:left="5040" w:hanging="360"/>
+      </w:pPr>
+      <w:rPr>
+        <w:rFonts w:ascii="Wingdings" w:hAnsi="Wingdings" w:hint="default"/>
+        <w:sz w:val="20"/>
+      </w:rPr>
+    </w:lvl>
+    <w:lvl w:ilvl="7" w:tentative="1">
+      <w:start w:val="1"/>
+      <w:numFmt w:val="bullet"/>
+      <w:lvlText w:val=""/>
+      <w:lvlJc w:val="left"/>
+      <w:pPr>
+        <w:tabs>
+          <w:tab w:val="num" w:pos="5760"/>
+        </w:tabs>
+        <w:ind w:left="5760" w:hanging="360"/>
+      </w:pPr>
+      <w:rPr>
+        <w:rFonts w:ascii="Wingdings" w:hAnsi="Wingdings" w:hint="default"/>
+        <w:sz w:val="20"/>
+      </w:rPr>
+    </w:lvl>
+    <w:lvl w:ilvl="8" w:tentative="1">
+      <w:start w:val="1"/>
+      <w:numFmt w:val="bullet"/>
+      <w:lvlText w:val=""/>
+      <w:lvlJc w:val="left"/>
+      <w:pPr>
+        <w:tabs>
+          <w:tab w:val="num" w:pos="6480"/>
+        </w:tabs>
+        <w:ind w:left="6480" w:hanging="360"/>
+      </w:pPr>
+      <w:rPr>
+        <w:rFonts w:ascii="Wingdings" w:hAnsi="Wingdings" w:hint="default"/>
+        <w:sz w:val="20"/>
+      </w:rPr>
+    </w:lvl>
+  </w:abstractNum>
   <w:num w:numId="1">
     <w:abstractNumId w:val="0"/>
+  </w:num>
+  <w:num w:numId="2">
+    <w:abstractNumId w:val="1"/>
   </w:num>
 </w:numbering>
 </file>
@@ -3567,7 +4696,6 @@
     <w:next w:val="Norml"/>
     <w:link w:val="Cmsor3Char"/>
     <w:uiPriority w:val="9"/>
-    <w:semiHidden/>
     <w:unhideWhenUsed/>
     <w:qFormat/>
     <w:rsid w:val="005D2D21"/>
@@ -3658,7 +4786,6 @@
     <w:basedOn w:val="Bekezdsalapbettpusa"/>
     <w:link w:val="Cmsor3"/>
     <w:uiPriority w:val="9"/>
-    <w:semiHidden/>
     <w:rsid w:val="005D2D21"/>
     <w:rPr>
       <w:rFonts w:asciiTheme="majorHAnsi" w:eastAsiaTheme="majorEastAsia" w:hAnsiTheme="majorHAnsi" w:cstheme="majorBidi"/>

</xml_diff>

<commit_message>
node.js és supabase doc
</commit_message>
<xml_diff>
--- a/docs/dokumentacio.docx
+++ b/docs/dokumentacio.docx
@@ -26,16 +26,16 @@
         <w:rPr>
           <w:rFonts w:ascii="Times New Roman" w:hAnsi="Times New Roman" w:cs="Times New Roman"/>
           <w:b/>
-          <w:sz w:val="30"/>
-          <w:szCs w:val="30"/>
+          <w:sz w:val="32"/>
+          <w:szCs w:val="32"/>
         </w:rPr>
       </w:pPr>
       <w:r>
         <w:rPr>
           <w:rFonts w:ascii="Times New Roman" w:hAnsi="Times New Roman" w:cs="Times New Roman"/>
           <w:b/>
-          <w:sz w:val="30"/>
-          <w:szCs w:val="30"/>
+          <w:sz w:val="32"/>
+          <w:szCs w:val="32"/>
         </w:rPr>
         <w:t xml:space="preserve">1. </w:t>
       </w:r>
@@ -43,8 +43,8 @@
         <w:rPr>
           <w:rFonts w:ascii="Times New Roman" w:hAnsi="Times New Roman" w:cs="Times New Roman"/>
           <w:b/>
-          <w:sz w:val="30"/>
-          <w:szCs w:val="30"/>
+          <w:sz w:val="32"/>
+          <w:szCs w:val="32"/>
         </w:rPr>
         <w:t>Bevezetés</w:t>
       </w:r>
@@ -55,16 +55,16 @@
         <w:rPr>
           <w:rFonts w:ascii="Times New Roman" w:hAnsi="Times New Roman" w:cs="Times New Roman"/>
           <w:b/>
-          <w:sz w:val="24"/>
-          <w:szCs w:val="24"/>
+          <w:sz w:val="28"/>
+          <w:szCs w:val="28"/>
         </w:rPr>
       </w:pPr>
       <w:r>
         <w:rPr>
           <w:rFonts w:ascii="Times New Roman" w:hAnsi="Times New Roman" w:cs="Times New Roman"/>
           <w:b/>
-          <w:sz w:val="24"/>
-          <w:szCs w:val="24"/>
+          <w:sz w:val="28"/>
+          <w:szCs w:val="28"/>
         </w:rPr>
         <w:t>1.1 A téma bemutatása</w:t>
       </w:r>
@@ -359,6 +359,8 @@
           <w:rFonts w:ascii="Times New Roman" w:hAnsi="Times New Roman" w:cs="Times New Roman"/>
           <w:b/>
           <w:color w:val="000000" w:themeColor="text1"/>
+          <w:sz w:val="28"/>
+          <w:szCs w:val="28"/>
         </w:rPr>
       </w:pPr>
       <w:r>
@@ -366,6 +368,8 @@
           <w:rFonts w:ascii="Times New Roman" w:hAnsi="Times New Roman" w:cs="Times New Roman"/>
           <w:b/>
           <w:color w:val="000000" w:themeColor="text1"/>
+          <w:sz w:val="28"/>
+          <w:szCs w:val="28"/>
         </w:rPr>
         <w:t>1.2. A projekt célja</w:t>
       </w:r>
@@ -376,7 +380,10 @@
         <w:jc w:val="both"/>
       </w:pPr>
       <w:r>
-        <w:t>A projekt elsődleges célja egy olyan webalapú gyártósor-felügyeleti rendszer megvalósítása, amely egy ESP32-S3 mikrokontroller segítségével szimulálja egy ipari gyártósor működését, és lehetővé teszi a folyamat állapotának távoli nyomon követését. A fejlesztés során fontos szempont egy olyan rendszer kialakítása, amely szemlélteti az ipari automatizálás, a dolgok internete (</w:t>
+        <w:t>A projekt elsődleges célja egy olyan webalapú gyártósor-felügyeleti rendszer megvalósítása, amely egy ESP32-S3 mikrokontroller segítségével szimulálja egy ipari gyártósor működését, és lehetővé teszi a folyamat állapotának távoli nyomon követését.</w:t>
+      </w:r>
+      <w:r>
+        <w:t xml:space="preserve"> A fejlesztés során fontos szempont egy olyan rendszer kialakítása, amely szemlélteti az ipari automatizálás, a dolgok internete (</w:t>
       </w:r>
       <w:proofErr w:type="spellStart"/>
       <w:r>
@@ -659,6 +666,8 @@
           <w:rFonts w:ascii="Times New Roman" w:hAnsi="Times New Roman" w:cs="Times New Roman"/>
           <w:b/>
           <w:color w:val="000000" w:themeColor="text1"/>
+          <w:sz w:val="28"/>
+          <w:szCs w:val="28"/>
         </w:rPr>
       </w:pPr>
       <w:r>
@@ -666,6 +675,8 @@
           <w:rFonts w:ascii="Times New Roman" w:hAnsi="Times New Roman" w:cs="Times New Roman"/>
           <w:b/>
           <w:color w:val="000000" w:themeColor="text1"/>
+          <w:sz w:val="28"/>
+          <w:szCs w:val="28"/>
         </w:rPr>
         <w:t>1.3. A projekt lépései</w:t>
       </w:r>
@@ -1063,8 +1074,6 @@
           <w:rFonts w:ascii="Times New Roman" w:hAnsi="Times New Roman" w:cs="Times New Roman"/>
           <w:b/>
           <w:color w:val="000000" w:themeColor="text1"/>
-          <w:sz w:val="30"/>
-          <w:szCs w:val="30"/>
         </w:rPr>
       </w:pPr>
       <w:r>
@@ -1072,8 +1081,6 @@
           <w:rFonts w:ascii="Times New Roman" w:hAnsi="Times New Roman" w:cs="Times New Roman"/>
           <w:b/>
           <w:color w:val="000000" w:themeColor="text1"/>
-          <w:sz w:val="30"/>
-          <w:szCs w:val="30"/>
         </w:rPr>
         <w:lastRenderedPageBreak/>
         <w:t>2. Az ESP32 mikrokontroller bemutatása</w:t>
@@ -1084,15 +1091,15 @@
         <w:pStyle w:val="Cmsor2"/>
         <w:rPr>
           <w:color w:val="000000" w:themeColor="text1"/>
-          <w:sz w:val="26"/>
-          <w:szCs w:val="26"/>
-        </w:rPr>
-      </w:pPr>
-      <w:r>
-        <w:rPr>
-          <w:color w:val="000000" w:themeColor="text1"/>
-          <w:sz w:val="26"/>
-          <w:szCs w:val="26"/>
+          <w:sz w:val="28"/>
+          <w:szCs w:val="28"/>
+        </w:rPr>
+      </w:pPr>
+      <w:r>
+        <w:rPr>
+          <w:color w:val="000000" w:themeColor="text1"/>
+          <w:sz w:val="28"/>
+          <w:szCs w:val="28"/>
         </w:rPr>
         <w:t>2.1. Az ESP32 általános ismertetése</w:t>
       </w:r>
@@ -1299,14 +1306,14 @@
       <w:pPr>
         <w:pStyle w:val="Cmsor2"/>
         <w:rPr>
-          <w:sz w:val="24"/>
-          <w:szCs w:val="24"/>
-        </w:rPr>
-      </w:pPr>
-      <w:r>
-        <w:rPr>
-          <w:sz w:val="24"/>
-          <w:szCs w:val="24"/>
+          <w:sz w:val="28"/>
+          <w:szCs w:val="28"/>
+        </w:rPr>
+      </w:pPr>
+      <w:r>
+        <w:rPr>
+          <w:sz w:val="28"/>
+          <w:szCs w:val="28"/>
         </w:rPr>
         <w:t>2.2. Az ESP32-S3-DEV-N16R8 fejlesztőpanel bemutatása</w:t>
       </w:r>
@@ -1626,8 +1633,8 @@
           <w:rFonts w:ascii="Times New Roman" w:eastAsia="Times New Roman" w:hAnsi="Times New Roman" w:cs="Times New Roman"/>
           <w:b/>
           <w:bCs/>
-          <w:sz w:val="24"/>
-          <w:szCs w:val="24"/>
+          <w:sz w:val="28"/>
+          <w:szCs w:val="28"/>
           <w:lang w:eastAsia="hu-HU"/>
         </w:rPr>
       </w:pPr>
@@ -1636,8 +1643,8 @@
           <w:rFonts w:ascii="Times New Roman" w:eastAsia="Times New Roman" w:hAnsi="Times New Roman" w:cs="Times New Roman"/>
           <w:b/>
           <w:bCs/>
-          <w:sz w:val="24"/>
-          <w:szCs w:val="24"/>
+          <w:sz w:val="28"/>
+          <w:szCs w:val="28"/>
           <w:lang w:eastAsia="hu-HU"/>
         </w:rPr>
         <w:t>2.3. A mikrokontroller főbb műszaki jellemzői</w:t>
@@ -2802,30 +2809,30 @@
       <w:pPr>
         <w:pStyle w:val="Cmsor2"/>
         <w:rPr>
-          <w:sz w:val="24"/>
-          <w:szCs w:val="24"/>
-        </w:rPr>
-      </w:pPr>
-      <w:r>
-        <w:rPr>
-          <w:sz w:val="24"/>
-          <w:szCs w:val="24"/>
+          <w:sz w:val="28"/>
+          <w:szCs w:val="28"/>
+        </w:rPr>
+      </w:pPr>
+      <w:r>
+        <w:rPr>
+          <w:sz w:val="28"/>
+          <w:szCs w:val="28"/>
         </w:rPr>
         <w:t xml:space="preserve">2.4. A </w:t>
       </w:r>
       <w:proofErr w:type="spellStart"/>
       <w:r>
         <w:rPr>
-          <w:sz w:val="24"/>
-          <w:szCs w:val="24"/>
+          <w:sz w:val="28"/>
+          <w:szCs w:val="28"/>
         </w:rPr>
         <w:t>Wi</w:t>
       </w:r>
       <w:proofErr w:type="spellEnd"/>
       <w:r>
         <w:rPr>
-          <w:sz w:val="24"/>
-          <w:szCs w:val="24"/>
+          <w:sz w:val="28"/>
+          <w:szCs w:val="28"/>
         </w:rPr>
         <w:t>-Fi-kommunikáció szerepe a projektben</w:t>
       </w:r>
@@ -2972,8 +2979,8 @@
         <w:jc w:val="both"/>
         <w:rPr>
           <w:rFonts w:ascii="Times New Roman" w:eastAsia="Times New Roman" w:hAnsi="Times New Roman" w:cs="Times New Roman"/>
-          <w:sz w:val="24"/>
-          <w:szCs w:val="24"/>
+          <w:sz w:val="32"/>
+          <w:szCs w:val="32"/>
           <w:lang w:eastAsia="hu-HU"/>
         </w:rPr>
       </w:pPr>
@@ -2981,8 +2988,8 @@
         <w:rPr>
           <w:rFonts w:ascii="Times New Roman" w:eastAsia="Times New Roman" w:hAnsi="Times New Roman" w:cs="Times New Roman"/>
           <w:b/>
-          <w:sz w:val="30"/>
-          <w:szCs w:val="30"/>
+          <w:sz w:val="32"/>
+          <w:szCs w:val="32"/>
           <w:lang w:eastAsia="hu-HU"/>
         </w:rPr>
         <w:t>3. A rendszer követelményei</w:t>
@@ -2995,8 +3002,8 @@
           <w:rFonts w:ascii="Times New Roman" w:hAnsi="Times New Roman" w:cs="Times New Roman"/>
           <w:b/>
           <w:color w:val="000000" w:themeColor="text1"/>
-          <w:sz w:val="26"/>
-          <w:szCs w:val="26"/>
+          <w:sz w:val="28"/>
+          <w:szCs w:val="28"/>
         </w:rPr>
       </w:pPr>
       <w:r>
@@ -3004,8 +3011,8 @@
           <w:rFonts w:ascii="Times New Roman" w:hAnsi="Times New Roman" w:cs="Times New Roman"/>
           <w:b/>
           <w:color w:val="000000" w:themeColor="text1"/>
-          <w:sz w:val="26"/>
-          <w:szCs w:val="26"/>
+          <w:sz w:val="28"/>
+          <w:szCs w:val="28"/>
         </w:rPr>
         <w:t xml:space="preserve">3.1. </w:t>
       </w:r>
@@ -3015,8 +3022,8 @@
           <w:rFonts w:ascii="Times New Roman" w:hAnsi="Times New Roman" w:cs="Times New Roman"/>
           <w:b/>
           <w:color w:val="000000" w:themeColor="text1"/>
-          <w:sz w:val="26"/>
-          <w:szCs w:val="26"/>
+          <w:sz w:val="28"/>
+          <w:szCs w:val="28"/>
         </w:rPr>
         <w:t>Funkcionális</w:t>
       </w:r>
@@ -3026,8 +3033,8 @@
           <w:rFonts w:ascii="Times New Roman" w:hAnsi="Times New Roman" w:cs="Times New Roman"/>
           <w:b/>
           <w:color w:val="000000" w:themeColor="text1"/>
-          <w:sz w:val="26"/>
-          <w:szCs w:val="26"/>
+          <w:sz w:val="28"/>
+          <w:szCs w:val="28"/>
         </w:rPr>
         <w:t xml:space="preserve"> követelmények</w:t>
       </w:r>
@@ -3101,22 +3108,28 @@
         <w:rPr>
           <w:color w:val="000000" w:themeColor="text1"/>
         </w:rPr>
-        <w:t xml:space="preserve"> állapota közvetlenül, vizuálisan is ellenőrizhető. A vezérlőprogram a termelési folyamatot szimulálja, és nyilvántartja a legyártott darabok számát.</w:t>
-      </w:r>
-    </w:p>
-    <w:p>
-      <w:pPr>
-        <w:pStyle w:val="NormlWeb"/>
-        <w:jc w:val="both"/>
-        <w:rPr>
-          <w:color w:val="000000" w:themeColor="text1"/>
-        </w:rPr>
-      </w:pPr>
+        <w:t xml:space="preserve"> állapota </w:t>
+      </w:r>
       <w:r>
         <w:rPr>
           <w:color w:val="000000" w:themeColor="text1"/>
         </w:rPr>
         <w:lastRenderedPageBreak/>
+        <w:t>közvetlenül, vizuálisan is ellenőrizhető. A vezérlőprogram a termelési folyamatot szimulálja, és nyilvántartja a legyártott darabok számát.</w:t>
+      </w:r>
+    </w:p>
+    <w:p>
+      <w:pPr>
+        <w:pStyle w:val="NormlWeb"/>
+        <w:jc w:val="both"/>
+        <w:rPr>
+          <w:color w:val="000000" w:themeColor="text1"/>
+        </w:rPr>
+      </w:pPr>
+      <w:r>
+        <w:rPr>
+          <w:color w:val="000000" w:themeColor="text1"/>
+        </w:rPr>
         <w:t xml:space="preserve">A mikrokontroller és a háttérrendszer közötti adatátvitel </w:t>
       </w:r>
       <w:proofErr w:type="spellStart"/>
@@ -3478,8 +3491,8 @@
           <w:rFonts w:ascii="Times New Roman" w:hAnsi="Times New Roman" w:cs="Times New Roman"/>
           <w:b/>
           <w:color w:val="000000" w:themeColor="text1"/>
-          <w:sz w:val="26"/>
-          <w:szCs w:val="26"/>
+          <w:sz w:val="28"/>
+          <w:szCs w:val="28"/>
         </w:rPr>
       </w:pPr>
       <w:r>
@@ -3487,8 +3500,8 @@
           <w:rFonts w:ascii="Times New Roman" w:hAnsi="Times New Roman" w:cs="Times New Roman"/>
           <w:b/>
           <w:color w:val="000000" w:themeColor="text1"/>
-          <w:sz w:val="26"/>
-          <w:szCs w:val="26"/>
+          <w:sz w:val="28"/>
+          <w:szCs w:val="28"/>
         </w:rPr>
         <w:t xml:space="preserve">3.2. Nem </w:t>
       </w:r>
@@ -3498,8 +3511,8 @@
           <w:rFonts w:ascii="Times New Roman" w:hAnsi="Times New Roman" w:cs="Times New Roman"/>
           <w:b/>
           <w:color w:val="000000" w:themeColor="text1"/>
-          <w:sz w:val="26"/>
-          <w:szCs w:val="26"/>
+          <w:sz w:val="28"/>
+          <w:szCs w:val="28"/>
         </w:rPr>
         <w:t>funkcionális</w:t>
       </w:r>
@@ -3509,8 +3522,8 @@
           <w:rFonts w:ascii="Times New Roman" w:hAnsi="Times New Roman" w:cs="Times New Roman"/>
           <w:b/>
           <w:color w:val="000000" w:themeColor="text1"/>
-          <w:sz w:val="26"/>
-          <w:szCs w:val="26"/>
+          <w:sz w:val="28"/>
+          <w:szCs w:val="28"/>
         </w:rPr>
         <w:t xml:space="preserve"> követelmények</w:t>
       </w:r>
@@ -3811,8 +3824,8 @@
           <w:rFonts w:ascii="Times New Roman" w:hAnsi="Times New Roman" w:cs="Times New Roman"/>
           <w:b/>
           <w:color w:val="000000" w:themeColor="text1"/>
-          <w:sz w:val="26"/>
-          <w:szCs w:val="26"/>
+          <w:sz w:val="28"/>
+          <w:szCs w:val="28"/>
         </w:rPr>
       </w:pPr>
       <w:r>
@@ -3820,8 +3833,8 @@
           <w:rFonts w:ascii="Times New Roman" w:hAnsi="Times New Roman" w:cs="Times New Roman"/>
           <w:b/>
           <w:color w:val="000000" w:themeColor="text1"/>
-          <w:sz w:val="26"/>
-          <w:szCs w:val="26"/>
+          <w:sz w:val="28"/>
+          <w:szCs w:val="28"/>
         </w:rPr>
         <w:t>3.3. A rendszerrel szemben támasztott elvárások</w:t>
       </w:r>
@@ -3959,8 +3972,6 @@
           <w:rFonts w:ascii="Times New Roman" w:hAnsi="Times New Roman" w:cs="Times New Roman"/>
           <w:b/>
           <w:color w:val="000000" w:themeColor="text1"/>
-          <w:sz w:val="30"/>
-          <w:szCs w:val="30"/>
         </w:rPr>
       </w:pPr>
       <w:r>
@@ -3968,8 +3979,6 @@
           <w:rFonts w:ascii="Times New Roman" w:hAnsi="Times New Roman" w:cs="Times New Roman"/>
           <w:b/>
           <w:color w:val="000000" w:themeColor="text1"/>
-          <w:sz w:val="30"/>
-          <w:szCs w:val="30"/>
         </w:rPr>
         <w:t>4. MQTT-alapú kommunikáció</w:t>
       </w:r>
@@ -3980,15 +3989,15 @@
         <w:jc w:val="both"/>
         <w:rPr>
           <w:color w:val="000000" w:themeColor="text1"/>
-          <w:sz w:val="26"/>
-          <w:szCs w:val="26"/>
-        </w:rPr>
-      </w:pPr>
-      <w:r>
-        <w:rPr>
-          <w:color w:val="000000" w:themeColor="text1"/>
-          <w:sz w:val="26"/>
-          <w:szCs w:val="26"/>
+          <w:sz w:val="28"/>
+          <w:szCs w:val="28"/>
+        </w:rPr>
+      </w:pPr>
+      <w:r>
+        <w:rPr>
+          <w:color w:val="000000" w:themeColor="text1"/>
+          <w:sz w:val="28"/>
+          <w:szCs w:val="28"/>
         </w:rPr>
         <w:t>4.1. Az MQTT protokoll bemutatása</w:t>
       </w:r>
@@ -4185,15 +4194,15 @@
         <w:jc w:val="both"/>
         <w:rPr>
           <w:color w:val="000000" w:themeColor="text1"/>
-          <w:sz w:val="26"/>
-          <w:szCs w:val="26"/>
-        </w:rPr>
-      </w:pPr>
-      <w:r>
-        <w:rPr>
-          <w:color w:val="000000" w:themeColor="text1"/>
-          <w:sz w:val="26"/>
-          <w:szCs w:val="26"/>
+          <w:sz w:val="28"/>
+          <w:szCs w:val="28"/>
+        </w:rPr>
+      </w:pPr>
+      <w:r>
+        <w:rPr>
+          <w:color w:val="000000" w:themeColor="text1"/>
+          <w:sz w:val="28"/>
+          <w:szCs w:val="28"/>
         </w:rPr>
         <w:t xml:space="preserve">4.2. Az MQTT </w:t>
       </w:r>
@@ -4201,8 +4210,8 @@
       <w:r>
         <w:rPr>
           <w:color w:val="000000" w:themeColor="text1"/>
-          <w:sz w:val="26"/>
-          <w:szCs w:val="26"/>
+          <w:sz w:val="28"/>
+          <w:szCs w:val="28"/>
         </w:rPr>
         <w:t>broker</w:t>
       </w:r>
@@ -4210,8 +4219,8 @@
       <w:r>
         <w:rPr>
           <w:color w:val="000000" w:themeColor="text1"/>
-          <w:sz w:val="26"/>
-          <w:szCs w:val="26"/>
+          <w:sz w:val="28"/>
+          <w:szCs w:val="28"/>
         </w:rPr>
         <w:t xml:space="preserve"> szerepe</w:t>
       </w:r>
@@ -4457,15 +4466,15 @@
         <w:jc w:val="both"/>
         <w:rPr>
           <w:color w:val="000000" w:themeColor="text1"/>
-          <w:sz w:val="26"/>
-          <w:szCs w:val="26"/>
-        </w:rPr>
-      </w:pPr>
-      <w:r>
-        <w:rPr>
-          <w:color w:val="000000" w:themeColor="text1"/>
-          <w:sz w:val="26"/>
-          <w:szCs w:val="26"/>
+          <w:sz w:val="28"/>
+          <w:szCs w:val="28"/>
+        </w:rPr>
+      </w:pPr>
+      <w:r>
+        <w:rPr>
+          <w:color w:val="000000" w:themeColor="text1"/>
+          <w:sz w:val="28"/>
+          <w:szCs w:val="28"/>
         </w:rPr>
         <w:t>4.3. Az ESP32-S3 és az MQTT kapcsolata</w:t>
       </w:r>
@@ -4752,15 +4761,15 @@
         <w:jc w:val="both"/>
         <w:rPr>
           <w:color w:val="000000" w:themeColor="text1"/>
-          <w:sz w:val="26"/>
-          <w:szCs w:val="26"/>
-        </w:rPr>
-      </w:pPr>
-      <w:r>
-        <w:rPr>
-          <w:color w:val="000000" w:themeColor="text1"/>
-          <w:sz w:val="26"/>
-          <w:szCs w:val="26"/>
+          <w:sz w:val="28"/>
+          <w:szCs w:val="28"/>
+        </w:rPr>
+      </w:pPr>
+      <w:r>
+        <w:rPr>
+          <w:color w:val="000000" w:themeColor="text1"/>
+          <w:sz w:val="28"/>
+          <w:szCs w:val="28"/>
         </w:rPr>
         <w:t>4.4. MQTT témakörök és üzenetstruktúra</w:t>
       </w:r>
@@ -5126,15 +5135,15 @@
         <w:jc w:val="both"/>
         <w:rPr>
           <w:color w:val="000000" w:themeColor="text1"/>
-          <w:sz w:val="26"/>
-          <w:szCs w:val="26"/>
-        </w:rPr>
-      </w:pPr>
-      <w:r>
-        <w:rPr>
-          <w:color w:val="000000" w:themeColor="text1"/>
-          <w:sz w:val="26"/>
-          <w:szCs w:val="26"/>
+          <w:sz w:val="28"/>
+          <w:szCs w:val="28"/>
+        </w:rPr>
+      </w:pPr>
+      <w:r>
+        <w:rPr>
+          <w:color w:val="000000" w:themeColor="text1"/>
+          <w:sz w:val="28"/>
+          <w:szCs w:val="28"/>
         </w:rPr>
         <w:t>4.5. A kommunikáció tesztelése</w:t>
       </w:r>
@@ -5146,204 +5155,1959 @@
         <w:rPr>
           <w:color w:val="000000" w:themeColor="text1"/>
         </w:rPr>
+      </w:pPr>
+      <w:r>
+        <w:rPr>
+          <w:color w:val="000000" w:themeColor="text1"/>
+        </w:rPr>
+        <w:t xml:space="preserve">Az MQTT-kommunikáció ellenőrzése több lépésben történik. Elsőként a </w:t>
+      </w:r>
+      <w:proofErr w:type="spellStart"/>
+      <w:r>
+        <w:rPr>
+          <w:color w:val="000000" w:themeColor="text1"/>
+        </w:rPr>
+        <w:t>Mosquitto</w:t>
+      </w:r>
+      <w:proofErr w:type="spellEnd"/>
+      <w:r>
+        <w:rPr>
+          <w:color w:val="000000" w:themeColor="text1"/>
+        </w:rPr>
+        <w:t xml:space="preserve"> </w:t>
+      </w:r>
+      <w:proofErr w:type="spellStart"/>
+      <w:r>
+        <w:rPr>
+          <w:color w:val="000000" w:themeColor="text1"/>
+        </w:rPr>
+        <w:t>broker</w:t>
+      </w:r>
+      <w:proofErr w:type="spellEnd"/>
+      <w:r>
+        <w:rPr>
+          <w:color w:val="000000" w:themeColor="text1"/>
+        </w:rPr>
+        <w:t xml:space="preserve"> elindítása és működésének ellenőrzése szükséges. Ezt követően a mikrokontroller </w:t>
+      </w:r>
+      <w:proofErr w:type="spellStart"/>
+      <w:r>
+        <w:rPr>
+          <w:color w:val="000000" w:themeColor="text1"/>
+        </w:rPr>
+        <w:t>Wi</w:t>
+      </w:r>
+      <w:proofErr w:type="spellEnd"/>
+      <w:r>
+        <w:rPr>
+          <w:color w:val="000000" w:themeColor="text1"/>
+        </w:rPr>
+        <w:t>-Fi-kapcsolata, majd az MQTT-</w:t>
+      </w:r>
+      <w:proofErr w:type="spellStart"/>
+      <w:r>
+        <w:rPr>
+          <w:color w:val="000000" w:themeColor="text1"/>
+        </w:rPr>
+        <w:t>brokerhez</w:t>
+      </w:r>
+      <w:proofErr w:type="spellEnd"/>
+      <w:r>
+        <w:rPr>
+          <w:color w:val="000000" w:themeColor="text1"/>
+        </w:rPr>
+        <w:t xml:space="preserve"> történő csatlakozása vizsgálható.</w:t>
+      </w:r>
+    </w:p>
+    <w:p>
+      <w:pPr>
+        <w:pStyle w:val="NormlWeb"/>
+        <w:jc w:val="both"/>
+        <w:rPr>
+          <w:color w:val="000000" w:themeColor="text1"/>
+        </w:rPr>
+      </w:pPr>
+      <w:r>
+        <w:rPr>
+          <w:color w:val="000000" w:themeColor="text1"/>
+        </w:rPr>
+        <w:t xml:space="preserve">A fejlesztés során sikeresen megvalósult az ESP32-S3 </w:t>
+      </w:r>
+      <w:proofErr w:type="spellStart"/>
+      <w:r>
+        <w:rPr>
+          <w:color w:val="000000" w:themeColor="text1"/>
+        </w:rPr>
+        <w:t>Wi</w:t>
+      </w:r>
+      <w:proofErr w:type="spellEnd"/>
+      <w:r>
+        <w:rPr>
+          <w:color w:val="000000" w:themeColor="text1"/>
+        </w:rPr>
+        <w:t xml:space="preserve">-Fi-hálózathoz történő csatlakoztatása és az MQTT-üzenetek továbbítása a helyi hálózaton futó </w:t>
+      </w:r>
+      <w:proofErr w:type="spellStart"/>
+      <w:r>
+        <w:rPr>
+          <w:color w:val="000000" w:themeColor="text1"/>
+        </w:rPr>
+        <w:t>Mosquitto</w:t>
+      </w:r>
+      <w:proofErr w:type="spellEnd"/>
+      <w:r>
+        <w:rPr>
+          <w:color w:val="000000" w:themeColor="text1"/>
+        </w:rPr>
+        <w:t xml:space="preserve"> </w:t>
+      </w:r>
+      <w:proofErr w:type="spellStart"/>
+      <w:r>
+        <w:rPr>
+          <w:color w:val="000000" w:themeColor="text1"/>
+        </w:rPr>
+        <w:t>broker</w:t>
+      </w:r>
+      <w:proofErr w:type="spellEnd"/>
+      <w:r>
+        <w:rPr>
+          <w:color w:val="000000" w:themeColor="text1"/>
+        </w:rPr>
+        <w:t xml:space="preserve"> felé. A kapcsolat ellenőrzése során a parancssori feliratkozó programmal megfigyelhetők voltak a mikrokontroller által küldött tesztüzenetek.</w:t>
+      </w:r>
+    </w:p>
+    <w:p>
+      <w:pPr>
+        <w:pStyle w:val="NormlWeb"/>
+        <w:jc w:val="both"/>
+        <w:rPr>
+          <w:color w:val="000000" w:themeColor="text1"/>
+        </w:rPr>
+      </w:pPr>
+      <w:r>
+        <w:rPr>
+          <w:color w:val="000000" w:themeColor="text1"/>
+        </w:rPr>
+        <w:t xml:space="preserve">A tesztelés igazolta, hogy az ESP32-S3 és a </w:t>
+      </w:r>
+      <w:proofErr w:type="spellStart"/>
+      <w:r>
+        <w:rPr>
+          <w:color w:val="000000" w:themeColor="text1"/>
+        </w:rPr>
+        <w:t>broker</w:t>
+      </w:r>
+      <w:proofErr w:type="spellEnd"/>
+      <w:r>
+        <w:rPr>
+          <w:color w:val="000000" w:themeColor="text1"/>
+        </w:rPr>
+        <w:t xml:space="preserve"> közötti alapvető kommunikáció működik. Ez megfelelő alapot biztosít a gyártósor állapotát és a termelési adatokat feldolgozó további szoftverkomponensek kialakításához.</w:t>
+      </w:r>
+    </w:p>
+    <w:p>
+      <w:pPr>
+        <w:pStyle w:val="NormlWeb"/>
+        <w:jc w:val="both"/>
+      </w:pPr>
+    </w:p>
+    <w:p>
+      <w:pPr>
+        <w:pStyle w:val="NormlWeb"/>
+        <w:jc w:val="both"/>
+      </w:pPr>
+    </w:p>
+    <w:p>
+      <w:pPr>
+        <w:pStyle w:val="NormlWeb"/>
+        <w:jc w:val="both"/>
+        <w:rPr>
+          <w:color w:val="000000" w:themeColor="text1"/>
+        </w:rPr>
+      </w:pPr>
+    </w:p>
+    <w:p>
+      <w:pPr>
+        <w:pStyle w:val="NormlWeb"/>
+        <w:jc w:val="both"/>
+        <w:rPr>
+          <w:color w:val="000000" w:themeColor="text1"/>
+        </w:rPr>
+      </w:pPr>
+    </w:p>
+    <w:p>
+      <w:pPr>
+        <w:pStyle w:val="NormlWeb"/>
+        <w:jc w:val="both"/>
+        <w:rPr>
+          <w:color w:val="000000" w:themeColor="text1"/>
+        </w:rPr>
+      </w:pPr>
+    </w:p>
+    <w:p>
+      <w:pPr>
+        <w:pStyle w:val="NormlWeb"/>
+        <w:ind w:firstLine="708"/>
+        <w:jc w:val="both"/>
+        <w:rPr>
+          <w:b/>
+          <w:sz w:val="32"/>
+          <w:szCs w:val="32"/>
+        </w:rPr>
+      </w:pPr>
+      <w:r>
+        <w:rPr>
+          <w:b/>
+          <w:sz w:val="32"/>
+          <w:szCs w:val="32"/>
+        </w:rPr>
+        <w:lastRenderedPageBreak/>
+        <w:t>5. A Node.js háttérprogram megvalósítása</w:t>
+      </w:r>
+    </w:p>
+    <w:p>
+      <w:pPr>
+        <w:pStyle w:val="Cmsor2"/>
+        <w:rPr>
+          <w:sz w:val="28"/>
+          <w:szCs w:val="28"/>
+        </w:rPr>
+      </w:pPr>
+      <w:r>
+        <w:rPr>
+          <w:sz w:val="28"/>
+          <w:szCs w:val="28"/>
+        </w:rPr>
+        <w:t>5.1. A Node.js környezet bemutatása</w:t>
+      </w:r>
+    </w:p>
+    <w:p>
+      <w:pPr>
+        <w:pStyle w:val="NormlWeb"/>
+        <w:jc w:val="both"/>
+      </w:pPr>
+      <w:r>
+        <w:t xml:space="preserve">A gyártósor-felügyeleti rendszer háttérprogramjának fejlesztéséhez a Node.js futtatókörnyezetet alkalmazom. A Node.js lehetővé teszi a JavaScript-kód szerveroldali végrehajtását, így alkalmas a </w:t>
+      </w:r>
+      <w:proofErr w:type="gramStart"/>
+      <w:r>
+        <w:t>rendszer különböző</w:t>
+      </w:r>
+      <w:proofErr w:type="gramEnd"/>
+      <w:r>
+        <w:t xml:space="preserve"> komponensei közötti kommunikáció és adatfeldolgozás megvalósítására. A háttérprogram elsődleges feladata az ESP32-S3 mikrokontrollertől érkező MQTT-üzenetek fogadása, feldolgozása és továbbítása az adatbázis felé.</w:t>
+      </w:r>
+    </w:p>
+    <w:p>
+      <w:pPr>
+        <w:pStyle w:val="NormlWeb"/>
+        <w:jc w:val="both"/>
+      </w:pPr>
+      <w:r>
+        <w:t xml:space="preserve">A rendszerben az ESP32-S3 a gyártósor működési állapotát és a termelési darabszámot MQTT-protokollon </w:t>
+      </w:r>
+      <w:proofErr w:type="gramStart"/>
+      <w:r>
+        <w:t>keresztül továbbítja</w:t>
+      </w:r>
+      <w:proofErr w:type="gramEnd"/>
+      <w:r>
+        <w:t xml:space="preserve"> a </w:t>
+      </w:r>
+      <w:proofErr w:type="spellStart"/>
+      <w:r>
+        <w:t>Mosquitto</w:t>
+      </w:r>
+      <w:proofErr w:type="spellEnd"/>
+      <w:r>
+        <w:t xml:space="preserve"> </w:t>
+      </w:r>
+      <w:proofErr w:type="spellStart"/>
+      <w:r>
+        <w:t>brokernek</w:t>
+      </w:r>
+      <w:proofErr w:type="spellEnd"/>
+      <w:r>
+        <w:t xml:space="preserve">. A Node.js alkalmazás feliratkozik a megfelelő témakörökre, fogadja az üzeneteket, majd feldolgozza azok tartalmát. Az állapotjelentésekből kinyert adatokat a </w:t>
+      </w:r>
+      <w:proofErr w:type="spellStart"/>
+      <w:r>
+        <w:t>Supabase</w:t>
+      </w:r>
+      <w:proofErr w:type="spellEnd"/>
+      <w:r>
+        <w:t xml:space="preserve"> adatbázisban tárolja, lehetővé téve azok későbbi lekérdezését és webes megjelenítését.</w:t>
+      </w:r>
+    </w:p>
+    <w:p>
+      <w:pPr>
+        <w:pStyle w:val="NormlWeb"/>
+        <w:jc w:val="both"/>
+      </w:pPr>
+      <w:r>
+        <w:t xml:space="preserve">A fejlesztés során az </w:t>
+      </w:r>
+      <w:proofErr w:type="spellStart"/>
+      <w:r>
+        <w:t>npm</w:t>
+      </w:r>
+      <w:proofErr w:type="spellEnd"/>
+      <w:r>
+        <w:t xml:space="preserve"> csomagkezelőt használom a szükséges függőségek telepítésére és kezelésére. Az MQTT-kommunikációt a </w:t>
+      </w:r>
+      <w:proofErr w:type="spellStart"/>
+      <w:r>
+        <w:rPr>
+          <w:rStyle w:val="HTML-kd"/>
+          <w:rFonts w:ascii="Times New Roman" w:eastAsiaTheme="majorEastAsia" w:hAnsi="Times New Roman" w:cs="Times New Roman"/>
+          <w:sz w:val="24"/>
+          <w:szCs w:val="24"/>
+        </w:rPr>
+        <w:t>mqtt</w:t>
+      </w:r>
+      <w:proofErr w:type="spellEnd"/>
+      <w:r>
+        <w:t xml:space="preserve">, a </w:t>
+      </w:r>
+      <w:proofErr w:type="spellStart"/>
+      <w:r>
+        <w:t>Supabase</w:t>
+      </w:r>
+      <w:proofErr w:type="spellEnd"/>
+      <w:r>
+        <w:t xml:space="preserve"> szolgáltatás elérését az </w:t>
+      </w:r>
+      <w:r>
+        <w:rPr>
+          <w:rStyle w:val="HTML-kd"/>
+          <w:rFonts w:ascii="Times New Roman" w:eastAsiaTheme="majorEastAsia" w:hAnsi="Times New Roman" w:cs="Times New Roman"/>
+          <w:sz w:val="24"/>
+          <w:szCs w:val="24"/>
+        </w:rPr>
+        <w:t>@</w:t>
+      </w:r>
+      <w:proofErr w:type="spellStart"/>
+      <w:r>
+        <w:rPr>
+          <w:rStyle w:val="HTML-kd"/>
+          <w:rFonts w:ascii="Times New Roman" w:eastAsiaTheme="majorEastAsia" w:hAnsi="Times New Roman" w:cs="Times New Roman"/>
+          <w:sz w:val="24"/>
+          <w:szCs w:val="24"/>
+        </w:rPr>
+        <w:t>supabase</w:t>
+      </w:r>
+      <w:proofErr w:type="spellEnd"/>
+      <w:r>
+        <w:rPr>
+          <w:rStyle w:val="HTML-kd"/>
+          <w:rFonts w:ascii="Times New Roman" w:eastAsiaTheme="majorEastAsia" w:hAnsi="Times New Roman" w:cs="Times New Roman"/>
+          <w:sz w:val="24"/>
+          <w:szCs w:val="24"/>
+        </w:rPr>
+        <w:t>/</w:t>
+      </w:r>
+      <w:proofErr w:type="spellStart"/>
+      <w:r>
+        <w:rPr>
+          <w:rStyle w:val="HTML-kd"/>
+          <w:rFonts w:ascii="Times New Roman" w:eastAsiaTheme="majorEastAsia" w:hAnsi="Times New Roman" w:cs="Times New Roman"/>
+          <w:sz w:val="24"/>
+          <w:szCs w:val="24"/>
+        </w:rPr>
+        <w:t>supabase-js</w:t>
+      </w:r>
+      <w:proofErr w:type="spellEnd"/>
+      <w:r>
+        <w:t xml:space="preserve">, a környezeti változók betöltését pedig a </w:t>
+      </w:r>
+      <w:proofErr w:type="spellStart"/>
+      <w:r>
+        <w:rPr>
+          <w:rStyle w:val="HTML-kd"/>
+          <w:rFonts w:ascii="Times New Roman" w:eastAsiaTheme="majorEastAsia" w:hAnsi="Times New Roman" w:cs="Times New Roman"/>
+          <w:sz w:val="24"/>
+          <w:szCs w:val="24"/>
+        </w:rPr>
+        <w:t>dotenv</w:t>
+      </w:r>
+      <w:proofErr w:type="spellEnd"/>
+      <w:r>
+        <w:t xml:space="preserve"> könyvtár biztosítja. Ezek a könyvtárak egyszerűsítik a külső szolgáltatások integrációját, és csökkentik a kapcsolódó </w:t>
+      </w:r>
+      <w:proofErr w:type="gramStart"/>
+      <w:r>
+        <w:t>funkciók</w:t>
+      </w:r>
+      <w:proofErr w:type="gramEnd"/>
+      <w:r>
+        <w:t xml:space="preserve"> megvalósításához szükséges saját kód mennyiségét.</w:t>
+      </w:r>
+    </w:p>
+    <w:p>
+      <w:pPr>
+        <w:pStyle w:val="NormlWeb"/>
+        <w:jc w:val="both"/>
+      </w:pPr>
+      <w:r>
+        <w:t xml:space="preserve">A háttérprogram az ESP32-S3 </w:t>
+      </w:r>
+      <w:proofErr w:type="spellStart"/>
+      <w:r>
+        <w:t>firmware-étől</w:t>
+      </w:r>
+      <w:proofErr w:type="spellEnd"/>
+      <w:r>
+        <w:t xml:space="preserve"> elkülönített </w:t>
+      </w:r>
+      <w:r>
+        <w:rPr>
+          <w:rStyle w:val="HTML-kd"/>
+          <w:rFonts w:ascii="Times New Roman" w:eastAsiaTheme="majorEastAsia" w:hAnsi="Times New Roman" w:cs="Times New Roman"/>
+          <w:sz w:val="24"/>
+          <w:szCs w:val="24"/>
+        </w:rPr>
+        <w:t>backend</w:t>
+      </w:r>
+      <w:r>
+        <w:t xml:space="preserve"> </w:t>
+      </w:r>
+      <w:proofErr w:type="gramStart"/>
+      <w:r>
+        <w:t>mappában</w:t>
+      </w:r>
+      <w:proofErr w:type="gramEnd"/>
+      <w:r>
+        <w:t xml:space="preserve"> található. A projekt függőségeit és alapvető beállításait a </w:t>
+      </w:r>
+      <w:proofErr w:type="spellStart"/>
+      <w:r>
+        <w:rPr>
+          <w:rStyle w:val="HTML-kd"/>
+          <w:rFonts w:ascii="Times New Roman" w:eastAsiaTheme="majorEastAsia" w:hAnsi="Times New Roman" w:cs="Times New Roman"/>
+          <w:sz w:val="24"/>
+          <w:szCs w:val="24"/>
+        </w:rPr>
+        <w:t>package.json</w:t>
+      </w:r>
+      <w:proofErr w:type="spellEnd"/>
+      <w:r>
+        <w:t xml:space="preserve"> </w:t>
+      </w:r>
+      <w:proofErr w:type="gramStart"/>
+      <w:r>
+        <w:t>fájl</w:t>
+      </w:r>
+      <w:proofErr w:type="gramEnd"/>
+      <w:r>
+        <w:t xml:space="preserve"> tartalmazza, míg az alkalmazás belépési pontja az </w:t>
+      </w:r>
+      <w:r>
+        <w:rPr>
+          <w:rStyle w:val="HTML-kd"/>
+          <w:rFonts w:ascii="Times New Roman" w:eastAsiaTheme="majorEastAsia" w:hAnsi="Times New Roman" w:cs="Times New Roman"/>
+          <w:sz w:val="24"/>
+          <w:szCs w:val="24"/>
+        </w:rPr>
+        <w:t>index.js</w:t>
+      </w:r>
+      <w:r>
+        <w:t xml:space="preserve">. A </w:t>
+      </w:r>
+      <w:proofErr w:type="spellStart"/>
+      <w:r>
+        <w:t>Supabase</w:t>
+      </w:r>
+      <w:proofErr w:type="spellEnd"/>
+      <w:r>
+        <w:t xml:space="preserve"> elérési címét és a hitelesítéshez szükséges titkos kulcsot a különálló </w:t>
+      </w:r>
+      <w:r>
+        <w:rPr>
+          <w:rStyle w:val="HTML-kd"/>
+          <w:rFonts w:ascii="Times New Roman" w:eastAsiaTheme="majorEastAsia" w:hAnsi="Times New Roman" w:cs="Times New Roman"/>
+          <w:sz w:val="24"/>
+          <w:szCs w:val="24"/>
+        </w:rPr>
+        <w:t>.</w:t>
+      </w:r>
+      <w:proofErr w:type="spellStart"/>
+      <w:r>
+        <w:rPr>
+          <w:rStyle w:val="HTML-kd"/>
+          <w:rFonts w:ascii="Times New Roman" w:eastAsiaTheme="majorEastAsia" w:hAnsi="Times New Roman" w:cs="Times New Roman"/>
+          <w:sz w:val="24"/>
+          <w:szCs w:val="24"/>
+        </w:rPr>
+        <w:t>env</w:t>
+      </w:r>
+      <w:proofErr w:type="spellEnd"/>
+      <w:r>
+        <w:t xml:space="preserve"> </w:t>
+      </w:r>
+      <w:proofErr w:type="gramStart"/>
+      <w:r>
+        <w:t>fájlban</w:t>
+      </w:r>
+      <w:proofErr w:type="gramEnd"/>
+      <w:r>
+        <w:t xml:space="preserve"> tárolom. Ezt a </w:t>
+      </w:r>
+      <w:proofErr w:type="gramStart"/>
+      <w:r>
+        <w:t>fájlt</w:t>
+      </w:r>
+      <w:proofErr w:type="gramEnd"/>
+      <w:r>
+        <w:t xml:space="preserve"> a </w:t>
+      </w:r>
+      <w:r>
+        <w:rPr>
+          <w:rStyle w:val="HTML-kd"/>
+          <w:rFonts w:ascii="Times New Roman" w:eastAsiaTheme="majorEastAsia" w:hAnsi="Times New Roman" w:cs="Times New Roman"/>
+          <w:sz w:val="24"/>
+          <w:szCs w:val="24"/>
+        </w:rPr>
+        <w:t>.</w:t>
+      </w:r>
+      <w:proofErr w:type="spellStart"/>
+      <w:r>
+        <w:rPr>
+          <w:rStyle w:val="HTML-kd"/>
+          <w:rFonts w:ascii="Times New Roman" w:eastAsiaTheme="majorEastAsia" w:hAnsi="Times New Roman" w:cs="Times New Roman"/>
+          <w:sz w:val="24"/>
+          <w:szCs w:val="24"/>
+        </w:rPr>
+        <w:t>gitignore</w:t>
+      </w:r>
+      <w:proofErr w:type="spellEnd"/>
+      <w:r>
+        <w:t xml:space="preserve"> segítségével kizárom a verziókezelésből, így a titkos kapcsolati adatok nem kerülnek be a megosztott forráskódba.</w:t>
+      </w:r>
+    </w:p>
+    <w:p>
+      <w:pPr>
+        <w:pStyle w:val="NormlWeb"/>
+        <w:jc w:val="both"/>
+      </w:pPr>
+      <w:r>
+        <w:t>A Node.js háttérprogram tehát közvetítő szerepet tölt be az MQTT-alapú adatkommunikáció és az adatbázis között. Működése lehetővé teszi, hogy a mikrokontroller által szolgáltatott termelési adatok tartósan tárolhatók és később feldolgozhatók legyenek, megalapozva ezzel a webes felügyeleti felület kialakítását.</w:t>
+      </w:r>
+    </w:p>
+    <w:p>
+      <w:pPr>
+        <w:pStyle w:val="NormlWeb"/>
+        <w:rPr>
+          <w:sz w:val="28"/>
+          <w:szCs w:val="28"/>
+        </w:rPr>
+      </w:pPr>
+      <w:r>
+        <w:rPr>
+          <w:rStyle w:val="Kiemels2"/>
+          <w:sz w:val="28"/>
+          <w:szCs w:val="28"/>
+        </w:rPr>
+        <w:t>5.2. Az MQTT-kommunikáció megvalósítása</w:t>
+      </w:r>
+    </w:p>
+    <w:p>
+      <w:pPr>
+        <w:pStyle w:val="NormlWeb"/>
+        <w:jc w:val="both"/>
+      </w:pPr>
+      <w:r>
+        <w:t xml:space="preserve">A Node.js háttérprogram az MQTT-protokoll segítségével kommunikál a </w:t>
+      </w:r>
+      <w:proofErr w:type="spellStart"/>
+      <w:r>
+        <w:t>Mosquitto</w:t>
+      </w:r>
+      <w:proofErr w:type="spellEnd"/>
+      <w:r>
+        <w:t xml:space="preserve"> </w:t>
+      </w:r>
+      <w:proofErr w:type="spellStart"/>
+      <w:r>
+        <w:t>brokerrel</w:t>
+      </w:r>
+      <w:proofErr w:type="spellEnd"/>
+      <w:r>
+        <w:t xml:space="preserve">. A megvalósításhoz az </w:t>
+      </w:r>
+      <w:proofErr w:type="spellStart"/>
+      <w:r>
+        <w:t>mqtt</w:t>
+      </w:r>
+      <w:proofErr w:type="spellEnd"/>
+      <w:r>
+        <w:t xml:space="preserve"> könyvtárat alkalmazom, amely biztosítja a </w:t>
+      </w:r>
+      <w:proofErr w:type="spellStart"/>
+      <w:r>
+        <w:t>brokerhez</w:t>
+      </w:r>
+      <w:proofErr w:type="spellEnd"/>
+      <w:r>
+        <w:t xml:space="preserve"> történő csatlakozást, az üzenetek fogadását és a megadott témakörökre való feliratkozást.</w:t>
+      </w:r>
+    </w:p>
+    <w:p>
+      <w:pPr>
+        <w:pStyle w:val="NormlWeb"/>
+        <w:jc w:val="both"/>
+      </w:pPr>
+      <w:r>
+        <w:t xml:space="preserve">A háttérprogram két MQTT-témakört figyel: a </w:t>
+      </w:r>
+      <w:proofErr w:type="spellStart"/>
+      <w:r>
+        <w:rPr>
+          <w:i/>
+        </w:rPr>
+        <w:t>gyartosor</w:t>
+      </w:r>
+      <w:proofErr w:type="spellEnd"/>
+      <w:r>
+        <w:rPr>
+          <w:i/>
+        </w:rPr>
+        <w:t>/esp32/status</w:t>
+      </w:r>
+      <w:r>
+        <w:t xml:space="preserve"> témakör a gyártósor </w:t>
+      </w:r>
+      <w:proofErr w:type="gramStart"/>
+      <w:r>
+        <w:t>aktuális</w:t>
+      </w:r>
+      <w:proofErr w:type="gramEnd"/>
+      <w:r>
+        <w:t xml:space="preserve"> állapotáról és a termelési darabszámról továbbít adatokat, míg a </w:t>
+      </w:r>
+      <w:proofErr w:type="spellStart"/>
+      <w:r>
+        <w:rPr>
+          <w:i/>
+        </w:rPr>
+        <w:t>gyartosor</w:t>
+      </w:r>
+      <w:proofErr w:type="spellEnd"/>
+      <w:r>
+        <w:rPr>
+          <w:i/>
+        </w:rPr>
+        <w:t>/esp32/</w:t>
+      </w:r>
+      <w:proofErr w:type="spellStart"/>
+      <w:r>
+        <w:rPr>
+          <w:i/>
+        </w:rPr>
+        <w:t>event</w:t>
+      </w:r>
+      <w:proofErr w:type="spellEnd"/>
+      <w:r>
+        <w:t xml:space="preserve"> témakör az állapotváltozásokhoz kapcsolódó eseményeket közvetíti. A beérkező üzenetek szöveges tartalmát a </w:t>
+      </w:r>
+      <w:proofErr w:type="spellStart"/>
+      <w:proofErr w:type="gramStart"/>
+      <w:r>
+        <w:rPr>
+          <w:i/>
+        </w:rPr>
+        <w:t>JSON.parse</w:t>
+      </w:r>
+      <w:proofErr w:type="spellEnd"/>
+      <w:r>
+        <w:rPr>
+          <w:i/>
+        </w:rPr>
+        <w:t>(</w:t>
+      </w:r>
+      <w:proofErr w:type="gramEnd"/>
+      <w:r>
+        <w:rPr>
+          <w:i/>
+        </w:rPr>
+        <w:t>)</w:t>
+      </w:r>
+      <w:r>
+        <w:t xml:space="preserve"> függvénnyel dolgozza fel, amely a JSON-adatokat JavaScript-objektummá alakítja. Amennyiben az üzenet formátuma hibás, a program jelzi a hibát, és megszakítja az adott üzenet további feldolgozását.</w:t>
+      </w:r>
+    </w:p>
+    <w:p>
+      <w:pPr>
+        <w:pStyle w:val="NormlWeb"/>
+        <w:jc w:val="both"/>
+      </w:pPr>
+      <w:r>
+        <w:t xml:space="preserve">Az állapotüzenetek feldolgozása során a program kiolvassa a status mezőben tárolt működési állapotot, valamint a </w:t>
+      </w:r>
+      <w:proofErr w:type="spellStart"/>
+      <w:r>
+        <w:rPr>
+          <w:i/>
+        </w:rPr>
+        <w:t>totalProduced</w:t>
+      </w:r>
+      <w:proofErr w:type="spellEnd"/>
+      <w:r>
+        <w:t xml:space="preserve"> mezőben </w:t>
+      </w:r>
+      <w:proofErr w:type="gramStart"/>
+      <w:r>
+        <w:t>szereplő termelési</w:t>
+      </w:r>
+      <w:proofErr w:type="gramEnd"/>
+      <w:r>
+        <w:t xml:space="preserve"> darabszámot. Ezek az adatok </w:t>
+      </w:r>
+      <w:r>
+        <w:lastRenderedPageBreak/>
+        <w:t xml:space="preserve">a </w:t>
+      </w:r>
+      <w:proofErr w:type="spellStart"/>
+      <w:r>
+        <w:t>Supabase</w:t>
+      </w:r>
+      <w:proofErr w:type="spellEnd"/>
+      <w:r>
+        <w:t xml:space="preserve"> adatbázis </w:t>
+      </w:r>
+      <w:proofErr w:type="spellStart"/>
+      <w:r>
+        <w:t>production_logs</w:t>
+      </w:r>
+      <w:proofErr w:type="spellEnd"/>
+      <w:r>
+        <w:t xml:space="preserve"> táblájába kerülnek. A táblában a gép állapota, az előállított termékek száma és a rögzítés időpontja is tárolható, így az adatok később lekérdezhetők és elemezhetők.</w:t>
+      </w:r>
+    </w:p>
+    <w:p>
+      <w:pPr>
+        <w:pStyle w:val="NormlWeb"/>
+        <w:jc w:val="both"/>
+      </w:pPr>
+      <w:r>
+        <w:t xml:space="preserve">A háttérprogram </w:t>
+      </w:r>
+      <w:proofErr w:type="spellStart"/>
+      <w:r>
+        <w:t>eseményvezérelt</w:t>
+      </w:r>
+      <w:proofErr w:type="spellEnd"/>
+      <w:r>
+        <w:t xml:space="preserve"> működésű: külön eseménykezelők felelnek a sikeres MQTT-kapcsolatért, a beérkező üzenetek feldolgozásáért és a kommunikációs hibák jelzéséért. Az adatbázisba történő mentés eredményét szintén ellenőrzi, így a sikertelen mentésekről hibaüzenet jelenik meg a konzolon. A kapcsolat megszakadása esetén az MQTT-könyvtár támogatja az újbóli csatlakozási kísérleteket.</w:t>
+      </w:r>
+    </w:p>
+    <w:p>
+      <w:pPr>
+        <w:pStyle w:val="NormlWeb"/>
+        <w:jc w:val="both"/>
+      </w:pPr>
+      <w:r>
+        <w:t>Az MQTT-kommunikáció megvalósításával létrejön az adatkapcsolat az ESP32-S3 mikrokontroller és a Node.js háttérprogram között. Ez lehetővé teszi a gyártósor állapotának és termelési adatainak fogadását, majd azok továbbítását az adatbázisba. A megoldás így megalapozza a tárolt adatok későbbi lekérdezését és webes megjelenítését.</w:t>
+      </w:r>
+    </w:p>
+    <w:p>
+      <w:pPr>
+        <w:pStyle w:val="NormlWeb"/>
+        <w:rPr>
+          <w:sz w:val="28"/>
+          <w:szCs w:val="28"/>
+        </w:rPr>
+      </w:pPr>
+      <w:r>
+        <w:rPr>
+          <w:rStyle w:val="Kiemels2"/>
+          <w:sz w:val="28"/>
+          <w:szCs w:val="28"/>
+        </w:rPr>
+        <w:t>5.3. Az adatfolyam teljes menete</w:t>
+      </w:r>
+    </w:p>
+    <w:p>
+      <w:pPr>
+        <w:pStyle w:val="NormlWeb"/>
+        <w:jc w:val="both"/>
+      </w:pPr>
+      <w:r>
+        <w:t xml:space="preserve">A rendszer felépítése egymásra épülő </w:t>
+      </w:r>
+      <w:proofErr w:type="gramStart"/>
+      <w:r>
+        <w:t>komponensekből</w:t>
+      </w:r>
+      <w:proofErr w:type="gramEnd"/>
+      <w:r>
+        <w:t xml:space="preserve"> áll, amelyek együttesen biztosítják a gyártósor adatainak továbbítását és tárolását. Az ESP32-S3 végzi a gyártási folyamat szimulációját, a </w:t>
+      </w:r>
+      <w:proofErr w:type="spellStart"/>
+      <w:r>
+        <w:t>Mosquitto</w:t>
+      </w:r>
+      <w:proofErr w:type="spellEnd"/>
+      <w:r>
+        <w:t xml:space="preserve"> </w:t>
+      </w:r>
+      <w:proofErr w:type="spellStart"/>
+      <w:r>
+        <w:t>broker</w:t>
+      </w:r>
+      <w:proofErr w:type="spellEnd"/>
+      <w:r>
+        <w:t xml:space="preserve"> az üzenetközvetítésért felel, a Node.js háttérprogram pedig az adatfeldolgozást és az adatbázissal való kommunikációt valósítja meg.</w:t>
+      </w:r>
+    </w:p>
+    <w:p>
+      <w:pPr>
+        <w:pStyle w:val="NormlWeb"/>
+        <w:jc w:val="both"/>
+      </w:pPr>
+      <w:r>
+        <w:t xml:space="preserve">A </w:t>
+      </w:r>
+      <w:proofErr w:type="gramStart"/>
+      <w:r>
+        <w:t>komponensek</w:t>
+      </w:r>
+      <w:proofErr w:type="gramEnd"/>
+      <w:r>
+        <w:t xml:space="preserve"> közötti adatáramlás egyirányú folyamatként írható le: a mikrokontroller által előállított adatok a kommunikációs rétegen keresztül jutnak el a háttérprogramhoz, amely azokat a </w:t>
+      </w:r>
+      <w:proofErr w:type="spellStart"/>
+      <w:r>
+        <w:t>Supabase</w:t>
+      </w:r>
+      <w:proofErr w:type="spellEnd"/>
+      <w:r>
+        <w:t xml:space="preserve"> adatbázisában tárolja. Az adatbázis biztosítja a termelési adatok tartós megőrzését, és lehetőséget teremt azok későbbi lekérdezésére.</w:t>
+      </w:r>
+    </w:p>
+    <w:p>
+      <w:pPr>
+        <w:pStyle w:val="NormlWeb"/>
+        <w:jc w:val="both"/>
+      </w:pPr>
+      <w:r>
+        <w:t>A rendszer jelenlegi felépítése előkészíti a webes felügyeleti felület integrációját. Ennek kialakításával a tárolt adatok a felhasználó számára is áttekinthetővé válnak, így a gyártósor állapota és a termelési darabszám egy központi felületen követhető lesz.</w:t>
+      </w:r>
+    </w:p>
+    <w:p>
+      <w:pPr>
+        <w:pStyle w:val="NormlWeb"/>
+        <w:jc w:val="both"/>
+        <w:rPr>
+          <w:sz w:val="28"/>
+          <w:szCs w:val="28"/>
+        </w:rPr>
+      </w:pPr>
+      <w:r>
+        <w:rPr>
+          <w:rStyle w:val="Kiemels2"/>
+          <w:sz w:val="28"/>
+          <w:szCs w:val="28"/>
+        </w:rPr>
+        <w:t xml:space="preserve">5.4. A </w:t>
+      </w:r>
+      <w:proofErr w:type="spellStart"/>
+      <w:r>
+        <w:rPr>
+          <w:rStyle w:val="Kiemels2"/>
+          <w:sz w:val="28"/>
+          <w:szCs w:val="28"/>
+        </w:rPr>
+        <w:t>Supabase</w:t>
+      </w:r>
+      <w:proofErr w:type="spellEnd"/>
+      <w:r>
+        <w:rPr>
+          <w:rStyle w:val="Kiemels2"/>
+          <w:sz w:val="28"/>
+          <w:szCs w:val="28"/>
+        </w:rPr>
+        <w:t xml:space="preserve"> adatbázis-integrációja</w:t>
+      </w:r>
+    </w:p>
+    <w:p>
+      <w:pPr>
+        <w:pStyle w:val="NormlWeb"/>
+        <w:jc w:val="both"/>
+      </w:pPr>
+      <w:r>
+        <w:t xml:space="preserve">A rendszer a termelési adatok tárolására a </w:t>
+      </w:r>
+      <w:proofErr w:type="spellStart"/>
+      <w:r>
+        <w:t>Supabase</w:t>
+      </w:r>
+      <w:proofErr w:type="spellEnd"/>
+      <w:r>
+        <w:t xml:space="preserve"> szolgáltatást használja, amely </w:t>
+      </w:r>
+      <w:proofErr w:type="spellStart"/>
+      <w:r>
+        <w:t>PostgreSQL</w:t>
+      </w:r>
+      <w:proofErr w:type="spellEnd"/>
+      <w:r>
+        <w:t>-alapú adatbázist biztosít. Az adatbázis feladata a gyártósor működési állapotának, a legyártott termékek számának és az adatok rögzítési időpontjának megőrzése.</w:t>
+      </w:r>
+    </w:p>
+    <w:p>
+      <w:pPr>
+        <w:pStyle w:val="NormlWeb"/>
+        <w:jc w:val="both"/>
+      </w:pPr>
+      <w:r>
+        <w:t xml:space="preserve">Az adatbázisban a </w:t>
+      </w:r>
+      <w:proofErr w:type="spellStart"/>
+      <w:r>
+        <w:rPr>
+          <w:rStyle w:val="Kiemels"/>
+          <w:rFonts w:eastAsiaTheme="majorEastAsia"/>
+        </w:rPr>
+        <w:t>production_logs</w:t>
+      </w:r>
+      <w:proofErr w:type="spellEnd"/>
+      <w:r>
+        <w:t xml:space="preserve"> tábla tárolja a háttérprogramtól érkező adatokat. A tábla egyedi azonosítóval rendelkező rekordokból áll, amelyek a gép állapotát, a termelési darabszámot és az időbélyeget tartalmazzák. Ez a felépítés lehetővé teszi a korábbi állapotjelentések megőrzését és a termelési adatok időbeli vizsgálatát.</w:t>
+      </w:r>
+    </w:p>
+    <w:p>
+      <w:pPr>
+        <w:pStyle w:val="NormlWeb"/>
+        <w:jc w:val="both"/>
+      </w:pPr>
+      <w:r>
+        <w:t xml:space="preserve">A Node.js alkalmazás az </w:t>
+      </w:r>
+      <w:r>
+        <w:rPr>
+          <w:rStyle w:val="Kiemels"/>
+          <w:rFonts w:eastAsiaTheme="majorEastAsia"/>
+        </w:rPr>
+        <w:t>@</w:t>
+      </w:r>
+      <w:proofErr w:type="spellStart"/>
+      <w:r>
+        <w:rPr>
+          <w:rStyle w:val="Kiemels"/>
+          <w:rFonts w:eastAsiaTheme="majorEastAsia"/>
+        </w:rPr>
+        <w:t>supabase</w:t>
+      </w:r>
+      <w:proofErr w:type="spellEnd"/>
+      <w:r>
+        <w:rPr>
+          <w:rStyle w:val="Kiemels"/>
+          <w:rFonts w:eastAsiaTheme="majorEastAsia"/>
+        </w:rPr>
+        <w:t>/</w:t>
+      </w:r>
+      <w:proofErr w:type="spellStart"/>
+      <w:r>
+        <w:rPr>
+          <w:rStyle w:val="Kiemels"/>
+          <w:rFonts w:eastAsiaTheme="majorEastAsia"/>
+        </w:rPr>
+        <w:t>supabase-js</w:t>
+      </w:r>
+      <w:proofErr w:type="spellEnd"/>
+      <w:r>
+        <w:t xml:space="preserve"> könyvtár segítségével kapcsolódik az adatbázishoz. Az adatmentés során a program a beérkező </w:t>
+      </w:r>
+      <w:proofErr w:type="spellStart"/>
+      <w:r>
+        <w:t>állapotadatokat</w:t>
+      </w:r>
+      <w:proofErr w:type="spellEnd"/>
+      <w:r>
+        <w:t xml:space="preserve"> a megfelelő </w:t>
+      </w:r>
+      <w:proofErr w:type="spellStart"/>
+      <w:r>
+        <w:t>mezőkhöz</w:t>
+      </w:r>
+      <w:proofErr w:type="spellEnd"/>
+      <w:r>
+        <w:t xml:space="preserve"> rendeli, majd új rekordként rögzíti a táblában. A művelet eredményét ellenőrzi, így sikertelen mentés esetén hibaüzenet jelenik meg a konzolon.</w:t>
+      </w:r>
+    </w:p>
+    <w:p>
+      <w:pPr>
+        <w:pStyle w:val="NormlWeb"/>
+        <w:jc w:val="both"/>
+      </w:pPr>
+      <w:r>
+        <w:t xml:space="preserve">A kapcsolat biztonságos konfigurálása érdekében az adatbázis elérési címét és a hozzáféréshez szükséges titkos kulcsot külön </w:t>
+      </w:r>
+      <w:r>
+        <w:rPr>
+          <w:rStyle w:val="Kiemels"/>
+          <w:rFonts w:eastAsiaTheme="majorEastAsia"/>
+        </w:rPr>
+        <w:t>.</w:t>
+      </w:r>
+      <w:proofErr w:type="spellStart"/>
+      <w:r>
+        <w:rPr>
+          <w:rStyle w:val="Kiemels"/>
+          <w:rFonts w:eastAsiaTheme="majorEastAsia"/>
+        </w:rPr>
+        <w:t>env</w:t>
+      </w:r>
+      <w:proofErr w:type="spellEnd"/>
+      <w:r>
+        <w:t xml:space="preserve"> </w:t>
+      </w:r>
+      <w:proofErr w:type="gramStart"/>
+      <w:r>
+        <w:t>fájlban</w:t>
+      </w:r>
+      <w:proofErr w:type="gramEnd"/>
+      <w:r>
+        <w:t xml:space="preserve"> tárolom. Ezt a </w:t>
+      </w:r>
+      <w:proofErr w:type="gramStart"/>
+      <w:r>
+        <w:t>fájlt</w:t>
+      </w:r>
+      <w:proofErr w:type="gramEnd"/>
+      <w:r>
+        <w:t xml:space="preserve"> a </w:t>
+      </w:r>
+      <w:r>
+        <w:rPr>
+          <w:rStyle w:val="Kiemels"/>
+          <w:rFonts w:eastAsiaTheme="majorEastAsia"/>
+        </w:rPr>
+        <w:t>.</w:t>
+      </w:r>
+      <w:proofErr w:type="spellStart"/>
+      <w:r>
+        <w:rPr>
+          <w:rStyle w:val="Kiemels"/>
+          <w:rFonts w:eastAsiaTheme="majorEastAsia"/>
+        </w:rPr>
+        <w:t>gitignore</w:t>
+      </w:r>
+      <w:proofErr w:type="spellEnd"/>
+      <w:r>
+        <w:t xml:space="preserve"> kizárja a </w:t>
+      </w:r>
+      <w:r>
+        <w:lastRenderedPageBreak/>
+        <w:t>verziókezelésből, így a bizalmas kapcsolati adatok nem kerülnek be a projekt megosztott forrásfájljai közé.</w:t>
+      </w:r>
+    </w:p>
+    <w:p>
+      <w:pPr>
+        <w:pStyle w:val="NormlWeb"/>
+        <w:jc w:val="both"/>
+      </w:pPr>
+      <w:r>
+        <w:t xml:space="preserve">A </w:t>
+      </w:r>
+      <w:proofErr w:type="spellStart"/>
+      <w:r>
+        <w:t>Supabase</w:t>
+      </w:r>
+      <w:proofErr w:type="spellEnd"/>
+      <w:r>
+        <w:t>-integrációval megvalósul a termelési adatok tartós tárolása. Az adatbázis így alapot biztosít a későbbi lekérdezésekhez, a termelési folyamat elemzéséhez és az adatok webes felületen történő megjelenítéséhez.</w:t>
+      </w:r>
+    </w:p>
+    <w:p>
+      <w:pPr>
+        <w:pStyle w:val="NormlWeb"/>
+        <w:rPr>
+          <w:sz w:val="28"/>
+          <w:szCs w:val="28"/>
+        </w:rPr>
+      </w:pPr>
+      <w:r>
+        <w:rPr>
+          <w:rStyle w:val="Kiemels2"/>
+          <w:sz w:val="28"/>
+          <w:szCs w:val="28"/>
+        </w:rPr>
+        <w:t>5.5. A háttérprogram tesztelése</w:t>
+      </w:r>
+    </w:p>
+    <w:p>
+      <w:pPr>
+        <w:pStyle w:val="NormlWeb"/>
+        <w:jc w:val="both"/>
+      </w:pPr>
+      <w:r>
+        <w:t xml:space="preserve">A háttérprogram működését az ESP32-S3 mikrokontroller, a </w:t>
+      </w:r>
+      <w:proofErr w:type="spellStart"/>
+      <w:r>
+        <w:t>Mosquitto</w:t>
+      </w:r>
+      <w:proofErr w:type="spellEnd"/>
+      <w:r>
+        <w:t xml:space="preserve"> </w:t>
+      </w:r>
+      <w:proofErr w:type="spellStart"/>
+      <w:r>
+        <w:t>broker</w:t>
+      </w:r>
+      <w:proofErr w:type="spellEnd"/>
+      <w:r>
+        <w:t xml:space="preserve"> és a </w:t>
+      </w:r>
+      <w:proofErr w:type="spellStart"/>
+      <w:r>
+        <w:t>Supabase</w:t>
+      </w:r>
+      <w:proofErr w:type="spellEnd"/>
+      <w:r>
+        <w:t xml:space="preserve"> adatbázis együttes használatával teszteltem. A vizsgálat célja annak ellenőrzése volt, hogy a mikrokontroller által küldött állapotadatok megfelelően eljutnak-e a háttérprogramhoz, majd sikeresen mentésre kerülnek-e az adatbázisban.</w:t>
+      </w:r>
+    </w:p>
+    <w:p>
+      <w:pPr>
+        <w:pStyle w:val="NormlWeb"/>
+        <w:jc w:val="both"/>
+      </w:pPr>
+      <w:r>
+        <w:t>A tesztelés során ellenőriztem az MQTT-kapcsolat létrejöttét, az üzenetek fogadását és a JSON-adatok feldolgozását. A Node.js alkalmazás konzolkimenete segítségével nyomon követhetővé vált a beérkező üzenetek tartalma, valamint az adatbázisba történő mentés eredménye.</w:t>
+      </w:r>
+    </w:p>
+    <w:p>
+      <w:pPr>
+        <w:pStyle w:val="NormlWeb"/>
+        <w:jc w:val="both"/>
+      </w:pPr>
+      <w:r>
+        <w:t xml:space="preserve">A </w:t>
+      </w:r>
+      <w:proofErr w:type="spellStart"/>
+      <w:r>
+        <w:t>Supabase</w:t>
+      </w:r>
+      <w:proofErr w:type="spellEnd"/>
+      <w:r>
+        <w:t xml:space="preserve"> felületén megvizsgáltam a </w:t>
+      </w:r>
+      <w:proofErr w:type="spellStart"/>
+      <w:r>
+        <w:rPr>
+          <w:rStyle w:val="Kiemels"/>
+          <w:rFonts w:eastAsiaTheme="majorEastAsia"/>
+        </w:rPr>
+        <w:t>production_logs</w:t>
+      </w:r>
+      <w:proofErr w:type="spellEnd"/>
+      <w:r>
+        <w:t xml:space="preserve"> táblában megjelenő rekordokat. A tárolt adatok között megtalálható volt a gyártósor </w:t>
+      </w:r>
+      <w:proofErr w:type="gramStart"/>
+      <w:r>
+        <w:t>aktuális</w:t>
+      </w:r>
+      <w:proofErr w:type="gramEnd"/>
+      <w:r>
+        <w:t xml:space="preserve"> állapota, a termelési darabszám és a rögzítés időpontja. A darabszám változásával új rekordok kerültek az adatbázisba, ami igazolta az adatmentési folyamat megfelelő működését.</w:t>
+      </w:r>
+    </w:p>
+    <w:p>
+      <w:pPr>
+        <w:pStyle w:val="NormlWeb"/>
+        <w:jc w:val="both"/>
+      </w:pPr>
+      <w:r>
+        <w:t xml:space="preserve">A tesztek alapján az ESP32-S3, az MQTT-kommunikáció, a Node.js háttérprogram és a </w:t>
+      </w:r>
+      <w:proofErr w:type="spellStart"/>
+      <w:r>
+        <w:t>Supabase</w:t>
+      </w:r>
+      <w:proofErr w:type="spellEnd"/>
+      <w:r>
+        <w:t xml:space="preserve"> adatbázis közötti adatátvitel sikeresen megvalósult. Ezzel a rendszer alapvető adatgyűjtési és adattárolási </w:t>
+      </w:r>
+      <w:proofErr w:type="gramStart"/>
+      <w:r>
+        <w:t>funkciói</w:t>
+      </w:r>
+      <w:proofErr w:type="gramEnd"/>
+      <w:r>
+        <w:t xml:space="preserve"> működőképessé váltak, és előkészítették a későbbi webes felügyeleti felület fejlesztését.</w:t>
+      </w:r>
+    </w:p>
+    <w:p>
+      <w:pPr>
+        <w:pStyle w:val="NormlWeb"/>
+        <w:ind w:firstLine="708"/>
+        <w:rPr>
+          <w:b/>
+          <w:sz w:val="32"/>
+          <w:szCs w:val="32"/>
+        </w:rPr>
+      </w:pPr>
+      <w:r>
+        <w:rPr>
+          <w:b/>
+          <w:sz w:val="32"/>
+          <w:szCs w:val="32"/>
+        </w:rPr>
+        <w:t xml:space="preserve">6. A </w:t>
+      </w:r>
+      <w:proofErr w:type="spellStart"/>
+      <w:r>
+        <w:rPr>
+          <w:b/>
+          <w:sz w:val="32"/>
+          <w:szCs w:val="32"/>
+        </w:rPr>
+        <w:t>Supabase</w:t>
+      </w:r>
+      <w:proofErr w:type="spellEnd"/>
+      <w:r>
+        <w:rPr>
+          <w:b/>
+          <w:sz w:val="32"/>
+          <w:szCs w:val="32"/>
+        </w:rPr>
+        <w:t xml:space="preserve"> adatbázis megvalósítása</w:t>
+      </w:r>
+    </w:p>
+    <w:p>
+      <w:pPr>
+        <w:pStyle w:val="NormlWeb"/>
+        <w:rPr>
+          <w:sz w:val="28"/>
+          <w:szCs w:val="28"/>
+        </w:rPr>
+      </w:pPr>
+      <w:r>
+        <w:rPr>
+          <w:rStyle w:val="Kiemels2"/>
+          <w:sz w:val="28"/>
+          <w:szCs w:val="28"/>
+        </w:rPr>
+        <w:t xml:space="preserve">6.1. A </w:t>
+      </w:r>
+      <w:proofErr w:type="spellStart"/>
+      <w:r>
+        <w:rPr>
+          <w:rStyle w:val="Kiemels2"/>
+          <w:sz w:val="28"/>
+          <w:szCs w:val="28"/>
+        </w:rPr>
+        <w:t>Supabase</w:t>
+      </w:r>
+      <w:proofErr w:type="spellEnd"/>
+      <w:r>
+        <w:rPr>
+          <w:rStyle w:val="Kiemels2"/>
+          <w:sz w:val="28"/>
+          <w:szCs w:val="28"/>
+        </w:rPr>
+        <w:t xml:space="preserve"> bemutatása</w:t>
+      </w:r>
+    </w:p>
+    <w:p>
+      <w:pPr>
+        <w:pStyle w:val="NormlWeb"/>
+        <w:jc w:val="both"/>
+      </w:pPr>
+      <w:r>
+        <w:t xml:space="preserve">A </w:t>
+      </w:r>
+      <w:proofErr w:type="spellStart"/>
+      <w:r>
+        <w:t>Supabase</w:t>
+      </w:r>
+      <w:proofErr w:type="spellEnd"/>
+      <w:r>
+        <w:t xml:space="preserve"> egy nyílt forráskódú technológiákra épülő háttérszolgáltatás, amely többek között </w:t>
+      </w:r>
+      <w:proofErr w:type="spellStart"/>
+      <w:r>
+        <w:t>PostgreSQL</w:t>
+      </w:r>
+      <w:proofErr w:type="spellEnd"/>
+      <w:r>
+        <w:t>-alapú adatbázist biztosít az alkalmazások számára. A projektben a termelési adatok tárolására és későbbi lekérdezésére használom. Az adatbázis központi szerepet tölt be, mivel lehetővé teszi a gyártósor működése során keletkező adatok tartós megőrzését.</w:t>
+      </w:r>
+    </w:p>
+    <w:p>
+      <w:pPr>
+        <w:pStyle w:val="NormlWeb"/>
+        <w:jc w:val="both"/>
+      </w:pPr>
+      <w:r>
+        <w:t xml:space="preserve">A rendszerben a </w:t>
+      </w:r>
+      <w:proofErr w:type="spellStart"/>
+      <w:r>
+        <w:t>Supabase</w:t>
+      </w:r>
+      <w:proofErr w:type="spellEnd"/>
+      <w:r>
+        <w:t xml:space="preserve"> a Node.js háttérprogramhoz kapcsolódik. A háttérprogram a mikrokontrollertől érkező állapotjelentések feldolgozása után az adatokat az adatbázisba menti. A tárolt </w:t>
+      </w:r>
+      <w:proofErr w:type="gramStart"/>
+      <w:r>
+        <w:t>információk</w:t>
+      </w:r>
+      <w:proofErr w:type="gramEnd"/>
+      <w:r>
+        <w:t xml:space="preserve"> közé tartozik a gyártósor aktuális állapota, a legyártott termékek száma és a rögzítés időpontja.</w:t>
+      </w:r>
+    </w:p>
+    <w:p>
+      <w:pPr>
+        <w:pStyle w:val="NormlWeb"/>
+        <w:jc w:val="both"/>
+      </w:pPr>
+      <w:r>
+        <w:t xml:space="preserve">A </w:t>
+      </w:r>
+      <w:proofErr w:type="spellStart"/>
+      <w:r>
+        <w:t>Supabase</w:t>
+      </w:r>
+      <w:proofErr w:type="spellEnd"/>
+      <w:r>
+        <w:t xml:space="preserve"> webes kezelőfelületet is biztosít az adatbázis kezeléséhez. Ezen keresztül létrehozhatók és módosíthatók a táblák, megtekinthetők a tárolt rekordok, valamint beállíthatók a hozzáférési jogosultságok. Ez megkönnyíti a fejlesztés során az adatbázis ellenőrzését és a mentési folyamat tesztelését.</w:t>
+      </w:r>
+    </w:p>
+    <w:p>
+      <w:pPr>
+        <w:pStyle w:val="NormlWeb"/>
+        <w:jc w:val="both"/>
+      </w:pPr>
+      <w:r>
+        <w:lastRenderedPageBreak/>
+        <w:t xml:space="preserve">A </w:t>
+      </w:r>
+      <w:proofErr w:type="spellStart"/>
+      <w:r>
+        <w:t>Supabase</w:t>
+      </w:r>
+      <w:proofErr w:type="spellEnd"/>
+      <w:r>
+        <w:t xml:space="preserve"> alkalmazásával a rendszer adatkezelése elkülönül a mikrokontroller működésétől. Ez a felépítés lehetővé teszi, hogy a termelési adatok később lekérdezhetők, elemezhetők és egy webes felügyeleti felületen megjeleníthetők legyenek.</w:t>
+      </w:r>
+    </w:p>
+    <w:p>
+      <w:pPr>
+        <w:pStyle w:val="NormlWeb"/>
+        <w:rPr>
+          <w:sz w:val="28"/>
+          <w:szCs w:val="28"/>
+        </w:rPr>
+      </w:pPr>
+      <w:r>
+        <w:rPr>
+          <w:rStyle w:val="Kiemels2"/>
+          <w:sz w:val="28"/>
+          <w:szCs w:val="28"/>
+        </w:rPr>
+        <w:t xml:space="preserve">6.2. Az adatbázis </w:t>
+      </w:r>
+      <w:proofErr w:type="gramStart"/>
+      <w:r>
+        <w:rPr>
+          <w:rStyle w:val="Kiemels2"/>
+          <w:sz w:val="28"/>
+          <w:szCs w:val="28"/>
+        </w:rPr>
+        <w:t>struktúrája</w:t>
+      </w:r>
+      <w:proofErr w:type="gramEnd"/>
+    </w:p>
+    <w:p>
+      <w:pPr>
+        <w:pStyle w:val="NormlWeb"/>
+        <w:jc w:val="both"/>
+      </w:pPr>
+      <w:r>
+        <w:t xml:space="preserve">A rendszer adatainak tárolására a </w:t>
+      </w:r>
+      <w:proofErr w:type="spellStart"/>
+      <w:r>
+        <w:t>Supabase</w:t>
+      </w:r>
+      <w:proofErr w:type="spellEnd"/>
+      <w:r>
+        <w:t xml:space="preserve"> adatbázisában egy </w:t>
+      </w:r>
+      <w:proofErr w:type="spellStart"/>
+      <w:r>
+        <w:rPr>
+          <w:rStyle w:val="Kiemels"/>
+          <w:rFonts w:eastAsiaTheme="majorEastAsia"/>
+        </w:rPr>
+        <w:t>production_logs</w:t>
+      </w:r>
+      <w:proofErr w:type="spellEnd"/>
+      <w:r>
+        <w:t xml:space="preserve"> nevű táblát hoztam létre. A tábla feladata a gyártósor működési állapotának, a termelési darabszámnak és az adatok rögzítési időpontjának tárolása. A megfelelően kialakított </w:t>
+      </w:r>
+      <w:proofErr w:type="gramStart"/>
+      <w:r>
+        <w:t>struktúra</w:t>
+      </w:r>
+      <w:proofErr w:type="gramEnd"/>
+      <w:r>
+        <w:t xml:space="preserve"> biztosítja, hogy a termelési információk egységes formában legyenek elérhetők.</w:t>
+      </w:r>
+    </w:p>
+    <w:p>
+      <w:pPr>
+        <w:pStyle w:val="NormlWeb"/>
+        <w:jc w:val="both"/>
+      </w:pPr>
+      <w:r>
+        <w:t xml:space="preserve">A tábla négy mezőből áll. Az </w:t>
+      </w:r>
+      <w:proofErr w:type="spellStart"/>
+      <w:r>
+        <w:rPr>
+          <w:rStyle w:val="Kiemels"/>
+          <w:rFonts w:eastAsiaTheme="majorEastAsia"/>
+        </w:rPr>
+        <w:t>id</w:t>
+      </w:r>
+      <w:proofErr w:type="spellEnd"/>
+      <w:r>
+        <w:t xml:space="preserve"> mező minden rekordhoz egyedi azonosítót rendel, amely elsődleges kulcsként szolgál. A </w:t>
+      </w:r>
+      <w:proofErr w:type="spellStart"/>
+      <w:r>
+        <w:rPr>
+          <w:rStyle w:val="Kiemels"/>
+          <w:rFonts w:eastAsiaTheme="majorEastAsia"/>
+        </w:rPr>
+        <w:t>machine_status</w:t>
+      </w:r>
+      <w:proofErr w:type="spellEnd"/>
+      <w:r>
+        <w:t xml:space="preserve"> a gyártósor </w:t>
+      </w:r>
+      <w:proofErr w:type="gramStart"/>
+      <w:r>
+        <w:t>aktuális</w:t>
+      </w:r>
+      <w:proofErr w:type="gramEnd"/>
+      <w:r>
+        <w:t xml:space="preserve"> állapotát tárolja szöveges formában, míg a </w:t>
+      </w:r>
+      <w:proofErr w:type="spellStart"/>
+      <w:r>
+        <w:rPr>
+          <w:rStyle w:val="Kiemels"/>
+          <w:rFonts w:eastAsiaTheme="majorEastAsia"/>
+        </w:rPr>
+        <w:t>total_produced</w:t>
+      </w:r>
+      <w:proofErr w:type="spellEnd"/>
+      <w:r>
+        <w:t xml:space="preserve"> mező az addig legyártott termékek számát tartalmazza. A </w:t>
+      </w:r>
+      <w:proofErr w:type="spellStart"/>
+      <w:r>
+        <w:rPr>
+          <w:rStyle w:val="Kiemels"/>
+          <w:rFonts w:eastAsiaTheme="majorEastAsia"/>
+        </w:rPr>
+        <w:t>recorded_at</w:t>
+      </w:r>
+      <w:proofErr w:type="spellEnd"/>
+      <w:r>
+        <w:t xml:space="preserve"> mező az adat rögzítésének időpontját tárolja időbélyeg formájában.</w:t>
+      </w:r>
+    </w:p>
+    <w:p>
+      <w:pPr>
+        <w:pStyle w:val="NormlWeb"/>
+        <w:jc w:val="both"/>
+      </w:pPr>
+      <w:r>
+        <w:t xml:space="preserve">Az adatbázisban az </w:t>
+      </w:r>
+      <w:proofErr w:type="spellStart"/>
+      <w:r>
+        <w:rPr>
+          <w:rStyle w:val="Kiemels"/>
+          <w:rFonts w:eastAsiaTheme="majorEastAsia"/>
+        </w:rPr>
+        <w:t>id</w:t>
+      </w:r>
+      <w:proofErr w:type="spellEnd"/>
+      <w:r>
+        <w:t xml:space="preserve"> mező </w:t>
+      </w:r>
+      <w:proofErr w:type="gramStart"/>
+      <w:r>
+        <w:t>automatikusan</w:t>
+      </w:r>
+      <w:proofErr w:type="gramEnd"/>
+      <w:r>
+        <w:t xml:space="preserve"> </w:t>
+      </w:r>
+      <w:proofErr w:type="spellStart"/>
+      <w:r>
+        <w:t>generálódik</w:t>
+      </w:r>
+      <w:proofErr w:type="spellEnd"/>
+      <w:r>
+        <w:t xml:space="preserve">, a </w:t>
+      </w:r>
+      <w:proofErr w:type="spellStart"/>
+      <w:r>
+        <w:rPr>
+          <w:rStyle w:val="Kiemels"/>
+          <w:rFonts w:eastAsiaTheme="majorEastAsia"/>
+        </w:rPr>
+        <w:t>recorded_at</w:t>
+      </w:r>
+      <w:proofErr w:type="spellEnd"/>
+      <w:r>
+        <w:t xml:space="preserve"> mező pedig alapértelmezés szerint a rögzítés időpontját kapja meg. A </w:t>
+      </w:r>
+      <w:proofErr w:type="spellStart"/>
+      <w:r>
+        <w:rPr>
+          <w:rStyle w:val="Kiemels"/>
+          <w:rFonts w:eastAsiaTheme="majorEastAsia"/>
+        </w:rPr>
+        <w:t>machine_status</w:t>
+      </w:r>
+      <w:proofErr w:type="spellEnd"/>
+      <w:r>
+        <w:t xml:space="preserve"> és a </w:t>
+      </w:r>
+      <w:proofErr w:type="spellStart"/>
+      <w:r>
+        <w:rPr>
+          <w:rStyle w:val="Kiemels"/>
+          <w:rFonts w:eastAsiaTheme="majorEastAsia"/>
+        </w:rPr>
+        <w:t>total_produced</w:t>
+      </w:r>
+      <w:proofErr w:type="spellEnd"/>
+      <w:r>
+        <w:t xml:space="preserve"> mezők kitöltése kötelező, így minden mentett rekord tartalmazza a legfontosabb termelési adatokat.</w:t>
+      </w:r>
+    </w:p>
+    <w:p>
+      <w:pPr>
+        <w:pStyle w:val="NormlWeb"/>
+        <w:jc w:val="both"/>
+      </w:pPr>
+      <w:r>
+        <w:t>Ez a táblaszerkezet lehetővé teszi a különböző időpontokban rögzített állapotjelentések elkülönített tárolását. A rekordok később lekérdezhetők, összehasonlíthatók, és felhasználhatók a termelési folyamat időbeli elemzéséhez.</w:t>
+      </w:r>
+    </w:p>
+    <w:p>
+      <w:pPr>
+        <w:pStyle w:val="NormlWeb"/>
+        <w:rPr>
+          <w:sz w:val="28"/>
+          <w:szCs w:val="28"/>
+        </w:rPr>
+      </w:pPr>
+      <w:r>
+        <w:rPr>
+          <w:rStyle w:val="Kiemels2"/>
+          <w:sz w:val="28"/>
+          <w:szCs w:val="28"/>
+        </w:rPr>
+        <w:t>6.3. Az adatok tárolása és kezelése</w:t>
+      </w:r>
+    </w:p>
+    <w:p>
+      <w:pPr>
+        <w:pStyle w:val="NormlWeb"/>
+        <w:jc w:val="both"/>
+      </w:pPr>
+      <w:r>
+        <w:t xml:space="preserve">A gyártósor működése során keletkező </w:t>
+      </w:r>
+      <w:proofErr w:type="spellStart"/>
+      <w:r>
+        <w:t>állapotadatokat</w:t>
+      </w:r>
+      <w:proofErr w:type="spellEnd"/>
+      <w:r>
+        <w:t xml:space="preserve"> a Node.js háttérprogram továbbítja a </w:t>
+      </w:r>
+      <w:proofErr w:type="spellStart"/>
+      <w:r>
+        <w:t>Supabase</w:t>
+      </w:r>
+      <w:proofErr w:type="spellEnd"/>
+      <w:r>
+        <w:t xml:space="preserve"> adatbázisába. Minden sikeres mentéskor új rekord jön létre a </w:t>
+      </w:r>
+      <w:proofErr w:type="spellStart"/>
+      <w:r>
+        <w:rPr>
+          <w:rStyle w:val="Kiemels"/>
+          <w:rFonts w:eastAsiaTheme="majorEastAsia"/>
+        </w:rPr>
+        <w:t>production_logs</w:t>
+      </w:r>
+      <w:proofErr w:type="spellEnd"/>
+      <w:r>
+        <w:t xml:space="preserve"> táblában, így a korábban rögzített adatok is megmaradnak. Ez lehetővé teszi a termelési folyamat változásainak későbbi áttekintését.</w:t>
+      </w:r>
+    </w:p>
+    <w:p>
+      <w:pPr>
+        <w:pStyle w:val="NormlWeb"/>
+        <w:jc w:val="both"/>
+      </w:pPr>
+      <w:r>
+        <w:t xml:space="preserve">A rekordok a gép működési állapotát, az addig legyártott termékek számát és a rögzítés időpontját tartalmazzák. Az időbélyeget az adatbázis </w:t>
+      </w:r>
+      <w:proofErr w:type="gramStart"/>
+      <w:r>
+        <w:t>automatikusan</w:t>
+      </w:r>
+      <w:proofErr w:type="gramEnd"/>
+      <w:r>
+        <w:t xml:space="preserve"> rendeli hozzá az új rekordhoz, ezért a mentett adatok időrendben is vizsgálhatók. A táblában tárolt </w:t>
+      </w:r>
+      <w:proofErr w:type="gramStart"/>
+      <w:r>
+        <w:t>információk</w:t>
+      </w:r>
+      <w:proofErr w:type="gramEnd"/>
+      <w:r>
+        <w:t xml:space="preserve"> a </w:t>
+      </w:r>
+      <w:proofErr w:type="spellStart"/>
+      <w:r>
+        <w:t>Supabase</w:t>
+      </w:r>
+      <w:proofErr w:type="spellEnd"/>
+      <w:r>
+        <w:t xml:space="preserve"> kezelőfelületén megtekinthetők, illetve SQL-lekérdezésekkel szűrhetők és rendezhetők.</w:t>
+      </w:r>
+    </w:p>
+    <w:p>
+      <w:pPr>
+        <w:pStyle w:val="NormlWeb"/>
+        <w:jc w:val="both"/>
+      </w:pPr>
+      <w:r>
+        <w:t>A jelenlegi megvalósításban a háttérprogram az állapotjelentéseket menti az adatbázisba. Az új rekordok segítségével nyomon követhető a termelési darabszám alakulása és a gyártósor különböző állapotainak rögzítése. A tárolt adatok később statisztikai elemzésekhez és a webes felügyeleti felület adatainak megjelenítéséhez is felhasználhatók.</w:t>
+      </w:r>
+    </w:p>
+    <w:p>
+      <w:pPr>
+        <w:pStyle w:val="NormlWeb"/>
+        <w:rPr>
+          <w:sz w:val="28"/>
+          <w:szCs w:val="28"/>
+        </w:rPr>
+      </w:pPr>
+      <w:r>
+        <w:rPr>
+          <w:rStyle w:val="Kiemels2"/>
+          <w:sz w:val="28"/>
+          <w:szCs w:val="28"/>
+        </w:rPr>
+        <w:t>6.4. Adatbázis-biztonság és hozzáférés</w:t>
+      </w:r>
+    </w:p>
+    <w:p>
+      <w:pPr>
+        <w:pStyle w:val="NormlWeb"/>
+        <w:jc w:val="both"/>
+      </w:pPr>
+      <w:r>
+        <w:t xml:space="preserve">Az adatbázis biztonságos működésének fontos része a hozzáférési jogosultságok megfelelő beállítása. A </w:t>
+      </w:r>
+      <w:proofErr w:type="spellStart"/>
+      <w:r>
+        <w:t>Supabase</w:t>
+      </w:r>
+      <w:proofErr w:type="spellEnd"/>
+      <w:r>
+        <w:t xml:space="preserve"> a </w:t>
+      </w:r>
+      <w:proofErr w:type="spellStart"/>
+      <w:r>
+        <w:t>PostgreSQL</w:t>
+      </w:r>
+      <w:proofErr w:type="spellEnd"/>
+      <w:r>
+        <w:t xml:space="preserve"> jogosultságkezelési lehetőségei mellett sor szintű hozzáférés-szabályozást is biztosít a </w:t>
+      </w:r>
+      <w:proofErr w:type="spellStart"/>
+      <w:r>
+        <w:t>Row</w:t>
+      </w:r>
+      <w:proofErr w:type="spellEnd"/>
+      <w:r>
+        <w:t xml:space="preserve"> </w:t>
+      </w:r>
+      <w:proofErr w:type="spellStart"/>
+      <w:r>
+        <w:t>Level</w:t>
+      </w:r>
+      <w:proofErr w:type="spellEnd"/>
+      <w:r>
+        <w:t xml:space="preserve"> </w:t>
+      </w:r>
+      <w:proofErr w:type="spellStart"/>
+      <w:r>
+        <w:t>Security</w:t>
+      </w:r>
+      <w:proofErr w:type="spellEnd"/>
+      <w:r>
+        <w:t xml:space="preserve"> (RLS) segítségével. Ennek engedélyezésével meghatározható, hogy az egyes felhasználók és alkalmazások milyen műveleteket végezhetnek az adatbázis tábláin.</w:t>
+      </w:r>
+    </w:p>
+    <w:p>
+      <w:pPr>
+        <w:pStyle w:val="NormlWeb"/>
+        <w:jc w:val="both"/>
+      </w:pPr>
+      <w:r>
+        <w:lastRenderedPageBreak/>
+        <w:t xml:space="preserve">A projektben a </w:t>
+      </w:r>
+      <w:proofErr w:type="spellStart"/>
+      <w:r>
+        <w:rPr>
+          <w:rStyle w:val="Kiemels"/>
+          <w:rFonts w:eastAsiaTheme="majorEastAsia"/>
+        </w:rPr>
+        <w:t>production_logs</w:t>
+      </w:r>
+      <w:proofErr w:type="spellEnd"/>
+      <w:r>
+        <w:t xml:space="preserve"> táblán engedélyeztem az RLS </w:t>
+      </w:r>
+      <w:proofErr w:type="gramStart"/>
+      <w:r>
+        <w:t>funkciót</w:t>
+      </w:r>
+      <w:proofErr w:type="gramEnd"/>
+      <w:r>
+        <w:t>. Az adatmentéshez a Node.js háttérprogram a környezeti változók között tárolt titkos kulcsot használja, amely lehetővé teszi a megfelelő jogosultságokkal rendelkező adatbázis-műveletek végrehajtását. A szükséges hozzáféréseket úgy kell beállítani, hogy a háttérprogram mentési műveletei működjenek, miközben illetéktelen alkalmazások ne férhessenek hozzá az adatokhoz.</w:t>
+      </w:r>
+    </w:p>
+    <w:p>
+      <w:pPr>
+        <w:pStyle w:val="NormlWeb"/>
+        <w:jc w:val="both"/>
+      </w:pPr>
+      <w:r>
+        <w:t xml:space="preserve">A hitelesítési adatok védelme érdekében a </w:t>
+      </w:r>
+      <w:proofErr w:type="spellStart"/>
+      <w:r>
+        <w:t>Supabase</w:t>
+      </w:r>
+      <w:proofErr w:type="spellEnd"/>
+      <w:r>
+        <w:t xml:space="preserve"> elérési címét és a titkos kulcsot a </w:t>
+      </w:r>
+      <w:r>
+        <w:rPr>
+          <w:rStyle w:val="Kiemels"/>
+          <w:rFonts w:eastAsiaTheme="majorEastAsia"/>
+        </w:rPr>
+        <w:t>backend/.</w:t>
+      </w:r>
+      <w:proofErr w:type="spellStart"/>
+      <w:r>
+        <w:rPr>
+          <w:rStyle w:val="Kiemels"/>
+          <w:rFonts w:eastAsiaTheme="majorEastAsia"/>
+        </w:rPr>
+        <w:t>env</w:t>
+      </w:r>
+      <w:proofErr w:type="spellEnd"/>
+      <w:r>
+        <w:t xml:space="preserve"> </w:t>
+      </w:r>
+      <w:proofErr w:type="gramStart"/>
+      <w:r>
+        <w:t>fájlban</w:t>
+      </w:r>
+      <w:proofErr w:type="gramEnd"/>
+      <w:r>
+        <w:t xml:space="preserve"> tárolom. A </w:t>
+      </w:r>
+      <w:proofErr w:type="gramStart"/>
+      <w:r>
+        <w:t>fájl</w:t>
+      </w:r>
+      <w:proofErr w:type="gramEnd"/>
+      <w:r>
+        <w:t xml:space="preserve"> szerepel a </w:t>
+      </w:r>
+      <w:r>
+        <w:rPr>
+          <w:rStyle w:val="Kiemels"/>
+          <w:rFonts w:eastAsiaTheme="majorEastAsia"/>
+        </w:rPr>
+        <w:t>.</w:t>
+      </w:r>
+      <w:proofErr w:type="spellStart"/>
+      <w:r>
+        <w:rPr>
+          <w:rStyle w:val="Kiemels"/>
+          <w:rFonts w:eastAsiaTheme="majorEastAsia"/>
+        </w:rPr>
+        <w:t>gitignore</w:t>
+      </w:r>
+      <w:proofErr w:type="spellEnd"/>
+      <w:r>
+        <w:t xml:space="preserve"> beállításai között, ezért a verziókezelés nem veszi fel a projekt megosztott fájljai közé. Ez csökkenti annak kockázatát, hogy a hozzáférési adatok véletlenül nyilvánosságra kerüljenek.</w:t>
+      </w:r>
+    </w:p>
+    <w:p>
+      <w:pPr>
+        <w:pStyle w:val="NormlWeb"/>
+        <w:rPr>
+          <w:sz w:val="28"/>
+          <w:szCs w:val="28"/>
+        </w:rPr>
+      </w:pPr>
+      <w:r>
+        <w:rPr>
+          <w:rStyle w:val="Kiemels2"/>
+          <w:sz w:val="28"/>
+          <w:szCs w:val="28"/>
+        </w:rPr>
+        <w:t>6.5. Az adatbázis tesztelése</w:t>
+      </w:r>
+    </w:p>
+    <w:p>
+      <w:pPr>
+        <w:pStyle w:val="NormlWeb"/>
+        <w:jc w:val="both"/>
+      </w:pPr>
+      <w:r>
+        <w:t xml:space="preserve">Az adatbázis tesztelésének célja annak ellenőrzése volt, hogy a Node.js háttérprogram által továbbított termelési adatok megfelelően mentődnek-e a </w:t>
+      </w:r>
+      <w:proofErr w:type="spellStart"/>
+      <w:r>
+        <w:t>Supabase</w:t>
+      </w:r>
+      <w:proofErr w:type="spellEnd"/>
+      <w:r>
+        <w:t xml:space="preserve"> adatbázisába. A vizsgálat során a </w:t>
+      </w:r>
+      <w:proofErr w:type="spellStart"/>
+      <w:r>
+        <w:t>Supabase</w:t>
+      </w:r>
+      <w:proofErr w:type="spellEnd"/>
+      <w:r>
+        <w:t xml:space="preserve"> kezelőfelületén megnyitottam a </w:t>
+      </w:r>
+      <w:proofErr w:type="spellStart"/>
+      <w:r>
+        <w:rPr>
+          <w:rStyle w:val="Kiemels"/>
+          <w:rFonts w:eastAsiaTheme="majorEastAsia"/>
+        </w:rPr>
+        <w:t>production_logs</w:t>
+      </w:r>
+      <w:proofErr w:type="spellEnd"/>
+      <w:r>
+        <w:t xml:space="preserve"> táblát, és ellenőriztem a rögzített rekordok tartalmát.</w:t>
+      </w:r>
+    </w:p>
+    <w:p>
+      <w:pPr>
+        <w:pStyle w:val="NormlWeb"/>
+        <w:jc w:val="both"/>
+      </w:pPr>
+      <w:r>
+        <w:t>A tesztelés során meggyőződtem arról, hogy a táblában megjelenik a gyártósor működési állapota, a termelési darabszám és az adatok rögzítésének időpontja. A mikrokontroller működése közben a darabszám változásával új rekordok kerültek az adatbázisba, így a termelési adatok alakulása több időpontban is nyomon követhetővé vált.</w:t>
+      </w:r>
+    </w:p>
+    <w:p>
+      <w:pPr>
+        <w:pStyle w:val="NormlWeb"/>
+        <w:jc w:val="both"/>
+      </w:pPr>
+      <w:r>
+        <w:t>A háttérprogram konzolkimenetén ellenőriztem az adatmentési műveletek eredményét is. Sikeres mentés esetén visszajelzés jelent meg, míg hiba esetén a program kiírta a kapcsolódó hibaüzenetet. Ez megkönnyítette az adatbázis-kapcsolat és az adatmentési folyamat ellenőrzését.</w:t>
+      </w:r>
+    </w:p>
+    <w:p>
+      <w:pPr>
+        <w:pStyle w:val="NormlWeb"/>
+        <w:jc w:val="both"/>
+      </w:pPr>
+      <w:r>
+        <w:t xml:space="preserve">A tesztelés eredményei alapján a </w:t>
+      </w:r>
+      <w:proofErr w:type="spellStart"/>
+      <w:r>
+        <w:t>Supabase</w:t>
+      </w:r>
+      <w:proofErr w:type="spellEnd"/>
+      <w:r>
+        <w:t xml:space="preserve"> adatbázis megfelelően együttműködik a Node.js háttérprogrammal, és alkalmas a gyártósor szimulációja során keletkező termelési adatok tárolására. Ezzel az adatgyűjtési és adattárolási folyamat működése igazolhatóvá vált.</w:t>
+      </w:r>
+    </w:p>
+    <w:p>
+      <w:pPr>
+        <w:pStyle w:val="NormlWeb"/>
+        <w:jc w:val="both"/>
       </w:pPr>
       <w:bookmarkStart w:id="0" w:name="_GoBack"/>
       <w:bookmarkEnd w:id="0"/>
-      <w:r>
-        <w:rPr>
-          <w:color w:val="000000" w:themeColor="text1"/>
-        </w:rPr>
-        <w:t xml:space="preserve">Az MQTT-kommunikáció ellenőrzése több lépésben történik. Elsőként a </w:t>
-      </w:r>
-      <w:proofErr w:type="spellStart"/>
-      <w:r>
-        <w:rPr>
-          <w:color w:val="000000" w:themeColor="text1"/>
-        </w:rPr>
-        <w:t>Mosquitto</w:t>
-      </w:r>
-      <w:proofErr w:type="spellEnd"/>
-      <w:r>
-        <w:rPr>
-          <w:color w:val="000000" w:themeColor="text1"/>
-        </w:rPr>
-        <w:t xml:space="preserve"> </w:t>
-      </w:r>
-      <w:proofErr w:type="spellStart"/>
-      <w:r>
-        <w:rPr>
-          <w:color w:val="000000" w:themeColor="text1"/>
-        </w:rPr>
-        <w:t>broker</w:t>
-      </w:r>
-      <w:proofErr w:type="spellEnd"/>
-      <w:r>
-        <w:rPr>
-          <w:color w:val="000000" w:themeColor="text1"/>
-        </w:rPr>
-        <w:t xml:space="preserve"> elindítása és működésének ellenőrzése szükséges. Ezt követően a mikrokontroller </w:t>
-      </w:r>
-      <w:proofErr w:type="spellStart"/>
-      <w:r>
-        <w:rPr>
-          <w:color w:val="000000" w:themeColor="text1"/>
-        </w:rPr>
-        <w:t>Wi</w:t>
-      </w:r>
-      <w:proofErr w:type="spellEnd"/>
-      <w:r>
-        <w:rPr>
-          <w:color w:val="000000" w:themeColor="text1"/>
-        </w:rPr>
-        <w:t>-Fi-kapcsolata, majd az MQTT-</w:t>
-      </w:r>
-      <w:proofErr w:type="spellStart"/>
-      <w:r>
-        <w:rPr>
-          <w:color w:val="000000" w:themeColor="text1"/>
-        </w:rPr>
-        <w:t>brokerhez</w:t>
-      </w:r>
-      <w:proofErr w:type="spellEnd"/>
-      <w:r>
-        <w:rPr>
-          <w:color w:val="000000" w:themeColor="text1"/>
-        </w:rPr>
-        <w:t xml:space="preserve"> történő csatlakozása vizsgálható.</w:t>
-      </w:r>
-    </w:p>
-    <w:p>
-      <w:pPr>
-        <w:pStyle w:val="NormlWeb"/>
-        <w:jc w:val="both"/>
-        <w:rPr>
-          <w:color w:val="000000" w:themeColor="text1"/>
-        </w:rPr>
-      </w:pPr>
-      <w:r>
-        <w:rPr>
-          <w:color w:val="000000" w:themeColor="text1"/>
-        </w:rPr>
-        <w:t xml:space="preserve">A fejlesztés során sikeresen megvalósult az ESP32-S3 </w:t>
-      </w:r>
-      <w:proofErr w:type="spellStart"/>
-      <w:r>
-        <w:rPr>
-          <w:color w:val="000000" w:themeColor="text1"/>
-        </w:rPr>
-        <w:t>Wi</w:t>
-      </w:r>
-      <w:proofErr w:type="spellEnd"/>
-      <w:r>
-        <w:rPr>
-          <w:color w:val="000000" w:themeColor="text1"/>
-        </w:rPr>
-        <w:t xml:space="preserve">-Fi-hálózathoz történő csatlakoztatása és az MQTT-üzenetek továbbítása a helyi hálózaton futó </w:t>
-      </w:r>
-      <w:proofErr w:type="spellStart"/>
-      <w:r>
-        <w:rPr>
-          <w:color w:val="000000" w:themeColor="text1"/>
-        </w:rPr>
-        <w:t>Mosquitto</w:t>
-      </w:r>
-      <w:proofErr w:type="spellEnd"/>
-      <w:r>
-        <w:rPr>
-          <w:color w:val="000000" w:themeColor="text1"/>
-        </w:rPr>
-        <w:t xml:space="preserve"> </w:t>
-      </w:r>
-      <w:proofErr w:type="spellStart"/>
-      <w:r>
-        <w:rPr>
-          <w:color w:val="000000" w:themeColor="text1"/>
-        </w:rPr>
-        <w:t>broker</w:t>
-      </w:r>
-      <w:proofErr w:type="spellEnd"/>
-      <w:r>
-        <w:rPr>
-          <w:color w:val="000000" w:themeColor="text1"/>
-        </w:rPr>
-        <w:t xml:space="preserve"> felé. A kapcsolat ellenőrzése során a parancssori feliratkozó programmal megfigyelhetők voltak a mikrokontroller által küldött tesztüzenetek.</w:t>
-      </w:r>
-    </w:p>
-    <w:p>
-      <w:pPr>
-        <w:pStyle w:val="NormlWeb"/>
-        <w:jc w:val="both"/>
-        <w:rPr>
-          <w:color w:val="000000" w:themeColor="text1"/>
-        </w:rPr>
-      </w:pPr>
-      <w:r>
-        <w:rPr>
-          <w:color w:val="000000" w:themeColor="text1"/>
-        </w:rPr>
-        <w:t xml:space="preserve">A tesztelés igazolta, hogy az ESP32-S3 és a </w:t>
-      </w:r>
-      <w:proofErr w:type="spellStart"/>
-      <w:r>
-        <w:rPr>
-          <w:color w:val="000000" w:themeColor="text1"/>
-        </w:rPr>
-        <w:t>broker</w:t>
-      </w:r>
-      <w:proofErr w:type="spellEnd"/>
-      <w:r>
-        <w:rPr>
-          <w:color w:val="000000" w:themeColor="text1"/>
-        </w:rPr>
-        <w:t xml:space="preserve"> közötti alapvető kommunikáció működik. Ez megfelelő alapot biztosít a gyártósor állapotát és a termelési adatokat feldolgozó további szoftverkomponensek kialakításához.</w:t>
-      </w:r>
-    </w:p>
-    <w:p>
-      <w:pPr>
-        <w:pStyle w:val="NormlWeb"/>
-        <w:jc w:val="both"/>
-      </w:pPr>
-    </w:p>
-    <w:p>
-      <w:pPr>
-        <w:pStyle w:val="NormlWeb"/>
-        <w:jc w:val="both"/>
-      </w:pPr>
-    </w:p>
-    <w:p>
-      <w:pPr>
-        <w:pStyle w:val="NormlWeb"/>
-        <w:jc w:val="both"/>
-        <w:rPr>
-          <w:color w:val="000000" w:themeColor="text1"/>
-        </w:rPr>
-      </w:pPr>
-    </w:p>
-    <w:p>
-      <w:pPr>
-        <w:pStyle w:val="NormlWeb"/>
-        <w:jc w:val="both"/>
-        <w:rPr>
-          <w:color w:val="000000" w:themeColor="text1"/>
-        </w:rPr>
-      </w:pPr>
-    </w:p>
-    <w:p>
-      <w:pPr>
-        <w:pStyle w:val="NormlWeb"/>
-        <w:jc w:val="both"/>
-        <w:rPr>
-          <w:color w:val="000000" w:themeColor="text1"/>
-        </w:rPr>
-      </w:pPr>
-    </w:p>
-    <w:p>
-      <w:pPr>
-        <w:pStyle w:val="NormlWeb"/>
-        <w:jc w:val="both"/>
-        <w:rPr>
-          <w:color w:val="000000" w:themeColor="text1"/>
-        </w:rPr>
+    </w:p>
+    <w:p>
+      <w:pPr>
+        <w:pStyle w:val="NormlWeb"/>
+        <w:jc w:val="both"/>
+      </w:pPr>
+    </w:p>
+    <w:p>
+      <w:pPr>
+        <w:pStyle w:val="NormlWeb"/>
+        <w:jc w:val="both"/>
+      </w:pPr>
+    </w:p>
+    <w:p>
+      <w:pPr>
+        <w:pStyle w:val="NormlWeb"/>
+        <w:jc w:val="both"/>
+      </w:pPr>
+    </w:p>
+    <w:p>
+      <w:pPr>
+        <w:pStyle w:val="NormlWeb"/>
+        <w:jc w:val="both"/>
+      </w:pPr>
+    </w:p>
+    <w:p>
+      <w:pPr>
+        <w:pStyle w:val="NormlWeb"/>
+        <w:jc w:val="both"/>
+      </w:pPr>
+    </w:p>
+    <w:p>
+      <w:pPr>
+        <w:pStyle w:val="NormlWeb"/>
+        <w:jc w:val="both"/>
+      </w:pPr>
+    </w:p>
+    <w:p>
+      <w:pPr>
+        <w:pStyle w:val="NormlWeb"/>
+        <w:jc w:val="both"/>
       </w:pPr>
     </w:p>
     <w:p>

</xml_diff>